<commit_message>
Add GitHub repository URL (https://github.com/lakmal6214/IDS-Forge-Research) to final dissertation docx
</commit_message>
<xml_diff>
--- a/docs/Dissertation_IDS_Forge_14519.docx
+++ b/docs/Dissertation_IDS_Forge_14519.docx
@@ -201,6 +201,35 @@
                 <w:sz w:val="22"/>
               </w:rPr>
               <w:t>Mr. Sahan Weerasinghe</w:t>
+            </w:r>
+          </w:p>
+        </w:tc>
+      </w:tr>
+      <w:tr>
+        <w:tc>
+          <w:tcPr>
+            <w:tcW w:type="dxa" w:w="3168"/>
+          </w:tcPr>
+          <w:p>
+            <w:r>
+              <w:rPr>
+                <w:b/>
+                <w:sz w:val="22"/>
+              </w:rPr>
+              <w:t>GitHub Repository:</w:t>
+            </w:r>
+          </w:p>
+        </w:tc>
+        <w:tc>
+          <w:tcPr>
+            <w:tcW w:type="dxa" w:w="6192"/>
+          </w:tcPr>
+          <w:p>
+            <w:r>
+              <w:rPr>
+                <w:sz w:val="22"/>
+              </w:rPr>
+              <w:t>https://github.com/lakmal6214/IDS-Forge-Research</w:t>
             </w:r>
           </w:p>
         </w:tc>
@@ -3301,7 +3330,7 @@
           <w:rFonts w:ascii="Times New Roman" w:hAnsi="Times New Roman"/>
           <w:sz w:val="24"/>
         </w:rPr>
-        <w:t xml:space="preserve"> Modular Python 3.14 package containing 9 core backend scripts (`src/data_loader.py`, `src/feature_selection.py`, `src/signature_engine.py`, `src/ml_models.py`, `src/hybrid_ids.py`, `src/evaluator.py`, `src/visualizer.py`, `main.py`, `app.py`).</w:t>
+        <w:t xml:space="preserve"> Open-source Python 3.14 package hosted at https://github.com/lakmal6214/IDS-Forge-Research containing 9 core backend scripts (`src/data_loader.py`, `src/feature_selection.py`, `src/signature_engine.py`, `src/ml_models.py`, `src/hybrid_ids.py`, `src/evaluator.py`, `src/visualizer.py`, `main.py`, `app.py`).</w:t>
       </w:r>
     </w:p>
     <w:p>
@@ -6560,7 +6589,7 @@
           <w:i w:val="0"/>
           <w:sz w:val="24"/>
         </w:rPr>
-        <w:t>The proposed Hybrid IDS software pipeline was constructed entirely in Python 3.14 within a isolated virtual environment (`.venv`). Development was conducted on an Intel Core processor system with 16 GB RAM running Windows 11 64-bit OS.</w:t>
+        <w:t>The proposed Hybrid IDS software pipeline was constructed entirely in Python 3.14 within an isolated virtual environment (`.venv`). Development was conducted on an Intel Core processor system with 16 GB RAM running Windows 11 64-bit OS. The full source code, dataset loaders, rule definitions, and visualization routines are publicly hosted at the official project GitHub repository: https://github.com/lakmal6214/IDS-Forge-Research.</w:t>
       </w:r>
     </w:p>
     <w:p>
@@ -13646,6 +13675,21 @@
       </w:pPr>
       <w:r>
         <w:rPr>
+          <w:rFonts w:ascii="Times New Roman" w:hAnsi="Times New Roman"/>
+          <w:b w:val="0"/>
+          <w:i w:val="0"/>
+          <w:sz w:val="24"/>
+        </w:rPr>
+        <w:t>GitHub Repository: https://github.com/lakmal6214/IDS-Forge-Research</w:t>
+      </w:r>
+    </w:p>
+    <w:p>
+      <w:pPr>
+        <w:spacing w:line="360" w:lineRule="auto" w:after="120"/>
+        <w:jc w:val="left"/>
+      </w:pPr>
+      <w:r>
+        <w:rPr>
           <w:rFonts w:ascii="Courier" w:hAnsi="Courier"/>
           <w:b w:val="0"/>
           <w:i w:val="0"/>

</xml_diff>

<commit_message>
Restructure dissertation docx using native MS Word tab stops with dot leaders for clean professional formatting
</commit_message>
<xml_diff>
--- a/docs/Dissertation_IDS_Forge_14519.docx
+++ b/docs/Dissertation_IDS_Forge_14519.docx
@@ -287,7 +287,7 @@
     <w:p>
       <w:pPr>
         <w:spacing w:line="360" w:lineRule="auto" w:after="120"/>
-        <w:jc w:val="left"/>
+        <w:jc w:val="both"/>
       </w:pPr>
       <w:r>
         <w:rPr>
@@ -302,7 +302,7 @@
     <w:p>
       <w:pPr>
         <w:spacing w:line="360" w:lineRule="auto" w:after="120"/>
-        <w:jc w:val="left"/>
+        <w:jc w:val="both"/>
       </w:pPr>
       <w:r>
         <w:rPr>
@@ -317,7 +317,7 @@
     <w:p>
       <w:pPr>
         <w:spacing w:line="360" w:lineRule="auto" w:after="120"/>
-        <w:jc w:val="left"/>
+        <w:jc w:val="both"/>
       </w:pPr>
       <w:r>
         <w:rPr>
@@ -414,7 +414,7 @@
     <w:p>
       <w:pPr>
         <w:spacing w:line="360" w:lineRule="auto" w:after="120"/>
-        <w:jc w:val="left"/>
+        <w:jc w:val="both"/>
       </w:pPr>
       <w:r>
         <w:rPr>
@@ -429,7 +429,7 @@
     <w:p>
       <w:pPr>
         <w:spacing w:line="360" w:lineRule="auto" w:after="120"/>
-        <w:jc w:val="left"/>
+        <w:jc w:val="both"/>
       </w:pPr>
       <w:r>
         <w:rPr>
@@ -444,7 +444,7 @@
     <w:p>
       <w:pPr>
         <w:spacing w:line="360" w:lineRule="auto" w:after="120"/>
-        <w:jc w:val="left"/>
+        <w:jc w:val="both"/>
       </w:pPr>
       <w:r>
         <w:rPr>
@@ -474,7 +474,7 @@
     <w:p>
       <w:pPr>
         <w:spacing w:line="360" w:lineRule="auto" w:after="120"/>
-        <w:jc w:val="left"/>
+        <w:jc w:val="both"/>
       </w:pPr>
       <w:r>
         <w:rPr>
@@ -489,7 +489,7 @@
     <w:p>
       <w:pPr>
         <w:spacing w:line="360" w:lineRule="auto" w:after="120"/>
-        <w:jc w:val="left"/>
+        <w:jc w:val="both"/>
       </w:pPr>
       <w:r>
         <w:rPr>
@@ -504,7 +504,7 @@
     <w:p>
       <w:pPr>
         <w:spacing w:line="360" w:lineRule="auto" w:after="120"/>
-        <w:jc w:val="left"/>
+        <w:jc w:val="both"/>
       </w:pPr>
       <w:r>
         <w:rPr>
@@ -519,7 +519,7 @@
     <w:p>
       <w:pPr>
         <w:spacing w:line="360" w:lineRule="auto" w:after="120"/>
-        <w:jc w:val="left"/>
+        <w:jc w:val="both"/>
       </w:pPr>
       <w:r>
         <w:rPr>
@@ -553,242 +553,1619 @@
     </w:p>
     <w:p>
       <w:pPr>
-        <w:spacing w:line="360" w:lineRule="auto" w:after="120"/>
+        <w:tabs>
+          <w:tab w:pos="9360" w:val="right" w:leader="dot"/>
+        </w:tabs>
+        <w:spacing w:line="312" w:lineRule="auto" w:after="80"/>
         <w:jc w:val="left"/>
       </w:pPr>
       <w:r>
         <w:rPr>
           <w:rFonts w:ascii="Times New Roman" w:hAnsi="Times New Roman"/>
-          <w:b w:val="0"/>
-          <w:i w:val="0"/>
-          <w:sz w:val="24"/>
-        </w:rPr>
-        <w:t>Declaration of Originality .................................................................................................................... ii</w:t>
+          <w:b/>
+          <w:sz w:val="22"/>
+        </w:rPr>
+        <w:t>Declaration of Originality</w:t>
+      </w:r>
+      <w:r>
+        <w:rPr>
+          <w:rFonts w:ascii="Times New Roman" w:hAnsi="Times New Roman"/>
+          <w:b/>
+          <w:sz w:val="22"/>
+        </w:rPr>
+        <w:tab/>
+        <w:t>ii</w:t>
       </w:r>
     </w:p>
     <w:p>
       <w:pPr>
-        <w:spacing w:line="360" w:lineRule="auto" w:after="120"/>
+        <w:tabs>
+          <w:tab w:pos="9360" w:val="right" w:leader="dot"/>
+        </w:tabs>
+        <w:spacing w:line="312" w:lineRule="auto" w:after="80"/>
         <w:jc w:val="left"/>
       </w:pPr>
       <w:r>
         <w:rPr>
           <w:rFonts w:ascii="Times New Roman" w:hAnsi="Times New Roman"/>
-          <w:b w:val="0"/>
-          <w:i w:val="0"/>
-          <w:sz w:val="24"/>
-        </w:rPr>
-        <w:t>Acknowledgements ............................................................................................................................. iii</w:t>
+          <w:b/>
+          <w:sz w:val="22"/>
+        </w:rPr>
+        <w:t>Acknowledgements</w:t>
+      </w:r>
+      <w:r>
+        <w:rPr>
+          <w:rFonts w:ascii="Times New Roman" w:hAnsi="Times New Roman"/>
+          <w:b/>
+          <w:sz w:val="22"/>
+        </w:rPr>
+        <w:tab/>
+        <w:t>iii</w:t>
       </w:r>
     </w:p>
     <w:p>
       <w:pPr>
-        <w:spacing w:line="360" w:lineRule="auto" w:after="120"/>
+        <w:tabs>
+          <w:tab w:pos="9360" w:val="right" w:leader="dot"/>
+        </w:tabs>
+        <w:spacing w:line="312" w:lineRule="auto" w:after="80"/>
         <w:jc w:val="left"/>
       </w:pPr>
       <w:r>
         <w:rPr>
           <w:rFonts w:ascii="Times New Roman" w:hAnsi="Times New Roman"/>
-          <w:b w:val="0"/>
-          <w:i w:val="0"/>
-          <w:sz w:val="24"/>
-        </w:rPr>
-        <w:t>Abstract ................................................................................................................................................ iv</w:t>
+          <w:b/>
+          <w:sz w:val="22"/>
+        </w:rPr>
+        <w:t>Abstract</w:t>
+      </w:r>
+      <w:r>
+        <w:rPr>
+          <w:rFonts w:ascii="Times New Roman" w:hAnsi="Times New Roman"/>
+          <w:b/>
+          <w:sz w:val="22"/>
+        </w:rPr>
+        <w:tab/>
+        <w:t>iv</w:t>
       </w:r>
     </w:p>
     <w:p>
       <w:pPr>
-        <w:spacing w:line="360" w:lineRule="auto" w:after="120"/>
+        <w:tabs>
+          <w:tab w:pos="9360" w:val="right" w:leader="dot"/>
+        </w:tabs>
+        <w:spacing w:line="312" w:lineRule="auto" w:after="80"/>
         <w:jc w:val="left"/>
       </w:pPr>
       <w:r>
         <w:rPr>
           <w:rFonts w:ascii="Times New Roman" w:hAnsi="Times New Roman"/>
-          <w:b w:val="0"/>
-          <w:i w:val="0"/>
-          <w:sz w:val="24"/>
-        </w:rPr>
-        <w:t>Table of Contents .................................................................................................................................... v</w:t>
+          <w:b/>
+          <w:sz w:val="22"/>
+        </w:rPr>
+        <w:t>Table of Contents</w:t>
+      </w:r>
+      <w:r>
+        <w:rPr>
+          <w:rFonts w:ascii="Times New Roman" w:hAnsi="Times New Roman"/>
+          <w:b/>
+          <w:sz w:val="22"/>
+        </w:rPr>
+        <w:tab/>
+        <w:t>v</w:t>
       </w:r>
     </w:p>
     <w:p>
       <w:pPr>
-        <w:spacing w:line="360" w:lineRule="auto" w:after="120"/>
+        <w:tabs>
+          <w:tab w:pos="9360" w:val="right" w:leader="dot"/>
+        </w:tabs>
+        <w:spacing w:line="312" w:lineRule="auto" w:after="80"/>
         <w:jc w:val="left"/>
       </w:pPr>
       <w:r>
         <w:rPr>
           <w:rFonts w:ascii="Times New Roman" w:hAnsi="Times New Roman"/>
-          <w:b w:val="0"/>
-          <w:i w:val="0"/>
-          <w:sz w:val="24"/>
-        </w:rPr>
-        <w:t>List of Figures ................................................................................................................................... vi</w:t>
+          <w:b/>
+          <w:sz w:val="22"/>
+        </w:rPr>
+        <w:t>List of Figures</w:t>
+      </w:r>
+      <w:r>
+        <w:rPr>
+          <w:rFonts w:ascii="Times New Roman" w:hAnsi="Times New Roman"/>
+          <w:b/>
+          <w:sz w:val="22"/>
+        </w:rPr>
+        <w:tab/>
+        <w:t>vi</w:t>
       </w:r>
     </w:p>
     <w:p>
       <w:pPr>
-        <w:spacing w:line="360" w:lineRule="auto" w:after="120"/>
+        <w:tabs>
+          <w:tab w:pos="9360" w:val="right" w:leader="dot"/>
+        </w:tabs>
+        <w:spacing w:line="312" w:lineRule="auto" w:after="80"/>
         <w:jc w:val="left"/>
       </w:pPr>
       <w:r>
         <w:rPr>
           <w:rFonts w:ascii="Times New Roman" w:hAnsi="Times New Roman"/>
-          <w:b w:val="0"/>
-          <w:i w:val="0"/>
-          <w:sz w:val="24"/>
-        </w:rPr>
-        <w:t>List of Tables ................................................................................................................................... vii</w:t>
+          <w:b/>
+          <w:sz w:val="22"/>
+        </w:rPr>
+        <w:t>List of Tables</w:t>
+      </w:r>
+      <w:r>
+        <w:rPr>
+          <w:rFonts w:ascii="Times New Roman" w:hAnsi="Times New Roman"/>
+          <w:b/>
+          <w:sz w:val="22"/>
+        </w:rPr>
+        <w:tab/>
+        <w:t>vii</w:t>
       </w:r>
     </w:p>
     <w:p>
       <w:pPr>
-        <w:spacing w:line="360" w:lineRule="auto" w:after="120"/>
+        <w:tabs>
+          <w:tab w:pos="9360" w:val="right" w:leader="dot"/>
+        </w:tabs>
+        <w:spacing w:line="312" w:lineRule="auto" w:after="80"/>
         <w:jc w:val="left"/>
       </w:pPr>
       <w:r>
         <w:rPr>
           <w:rFonts w:ascii="Times New Roman" w:hAnsi="Times New Roman"/>
-          <w:b w:val="0"/>
-          <w:i w:val="0"/>
-          <w:sz w:val="24"/>
-        </w:rPr>
-        <w:t>List of Abbreviations ....................................................................................................................... viii</w:t>
+          <w:b/>
+          <w:sz w:val="22"/>
+        </w:rPr>
+        <w:t>List of Abbreviations</w:t>
+      </w:r>
+      <w:r>
+        <w:rPr>
+          <w:rFonts w:ascii="Times New Roman" w:hAnsi="Times New Roman"/>
+          <w:b/>
+          <w:sz w:val="22"/>
+        </w:rPr>
+        <w:tab/>
+        <w:t>viii</w:t>
       </w:r>
     </w:p>
     <w:p>
       <w:pPr>
-        <w:spacing w:line="360" w:lineRule="auto" w:after="120"/>
+        <w:tabs>
+          <w:tab w:pos="9360" w:val="right" w:leader="dot"/>
+        </w:tabs>
+        <w:spacing w:line="312" w:lineRule="auto" w:after="80"/>
         <w:jc w:val="left"/>
       </w:pPr>
       <w:r>
         <w:rPr>
           <w:rFonts w:ascii="Times New Roman" w:hAnsi="Times New Roman"/>
-          <w:b w:val="0"/>
-          <w:i w:val="0"/>
-          <w:sz w:val="24"/>
-        </w:rPr>
-        <w:t>Chapter 1: Introduction ........................................................................................................................ 1</w:t>
+          <w:b/>
+          <w:sz w:val="22"/>
+        </w:rPr>
+        <w:t>Chapter 1: Introduction</w:t>
+      </w:r>
+      <w:r>
+        <w:rPr>
+          <w:rFonts w:ascii="Times New Roman" w:hAnsi="Times New Roman"/>
+          <w:b/>
+          <w:sz w:val="22"/>
+        </w:rPr>
+        <w:tab/>
+        <w:t>1</w:t>
       </w:r>
     </w:p>
     <w:p>
       <w:pPr>
-        <w:spacing w:line="360" w:lineRule="auto" w:after="120"/>
+        <w:tabs>
+          <w:tab w:pos="9360" w:val="right" w:leader="dot"/>
+        </w:tabs>
+        <w:spacing w:line="312" w:lineRule="auto" w:after="80"/>
         <w:jc w:val="left"/>
       </w:pPr>
       <w:r>
         <w:rPr>
           <w:rFonts w:ascii="Times New Roman" w:hAnsi="Times New Roman"/>
           <w:b w:val="0"/>
-          <w:i w:val="0"/>
-          <w:sz w:val="24"/>
-        </w:rPr>
-        <w:t>Chapter 2: Literature Review ............................................................................................................... 7</w:t>
+          <w:sz w:val="22"/>
+        </w:rPr>
+        <w:t xml:space="preserve">    1.1 Project Background and Motivation</w:t>
+      </w:r>
+      <w:r>
+        <w:rPr>
+          <w:rFonts w:ascii="Times New Roman" w:hAnsi="Times New Roman"/>
+          <w:b w:val="0"/>
+          <w:sz w:val="22"/>
+        </w:rPr>
+        <w:tab/>
+        <w:t>1</w:t>
       </w:r>
     </w:p>
     <w:p>
       <w:pPr>
-        <w:spacing w:line="360" w:lineRule="auto" w:after="120"/>
+        <w:tabs>
+          <w:tab w:pos="9360" w:val="right" w:leader="dot"/>
+        </w:tabs>
+        <w:spacing w:line="312" w:lineRule="auto" w:after="80"/>
         <w:jc w:val="left"/>
       </w:pPr>
       <w:r>
         <w:rPr>
           <w:rFonts w:ascii="Times New Roman" w:hAnsi="Times New Roman"/>
           <w:b w:val="0"/>
-          <w:i w:val="0"/>
-          <w:sz w:val="24"/>
-        </w:rPr>
-        <w:t>Chapter 3: Methodology .................................................................................................................... 16</w:t>
+          <w:sz w:val="22"/>
+        </w:rPr>
+        <w:t xml:space="preserve">    1.2 Problem Statement</w:t>
+      </w:r>
+      <w:r>
+        <w:rPr>
+          <w:rFonts w:ascii="Times New Roman" w:hAnsi="Times New Roman"/>
+          <w:b w:val="0"/>
+          <w:sz w:val="22"/>
+        </w:rPr>
+        <w:tab/>
+        <w:t>3</w:t>
       </w:r>
     </w:p>
     <w:p>
       <w:pPr>
-        <w:spacing w:line="360" w:lineRule="auto" w:after="120"/>
+        <w:tabs>
+          <w:tab w:pos="9360" w:val="right" w:leader="dot"/>
+        </w:tabs>
+        <w:spacing w:line="312" w:lineRule="auto" w:after="80"/>
         <w:jc w:val="left"/>
       </w:pPr>
       <w:r>
         <w:rPr>
           <w:rFonts w:ascii="Times New Roman" w:hAnsi="Times New Roman"/>
           <w:b w:val="0"/>
-          <w:i w:val="0"/>
-          <w:sz w:val="24"/>
-        </w:rPr>
-        <w:t>Chapter 4: Implementation ................................................................................................................. 24</w:t>
+          <w:sz w:val="22"/>
+        </w:rPr>
+        <w:t xml:space="preserve">    1.3 Project Aim and Objectives</w:t>
+      </w:r>
+      <w:r>
+        <w:rPr>
+          <w:rFonts w:ascii="Times New Roman" w:hAnsi="Times New Roman"/>
+          <w:b w:val="0"/>
+          <w:sz w:val="22"/>
+        </w:rPr>
+        <w:tab/>
+        <w:t>4</w:t>
       </w:r>
     </w:p>
     <w:p>
       <w:pPr>
-        <w:spacing w:line="360" w:lineRule="auto" w:after="120"/>
+        <w:tabs>
+          <w:tab w:pos="9360" w:val="right" w:leader="dot"/>
+        </w:tabs>
+        <w:spacing w:line="312" w:lineRule="auto" w:after="80"/>
         <w:jc w:val="left"/>
       </w:pPr>
       <w:r>
         <w:rPr>
           <w:rFonts w:ascii="Times New Roman" w:hAnsi="Times New Roman"/>
           <w:b w:val="0"/>
-          <w:i w:val="0"/>
-          <w:sz w:val="24"/>
-        </w:rPr>
-        <w:t>Chapter 5: Results and Evaluation ...................................................................................................... 31</w:t>
+          <w:sz w:val="22"/>
+        </w:rPr>
+        <w:t xml:space="preserve">    1.4 Research Questions</w:t>
+      </w:r>
+      <w:r>
+        <w:rPr>
+          <w:rFonts w:ascii="Times New Roman" w:hAnsi="Times New Roman"/>
+          <w:b w:val="0"/>
+          <w:sz w:val="22"/>
+        </w:rPr>
+        <w:tab/>
+        <w:t>5</w:t>
       </w:r>
     </w:p>
     <w:p>
       <w:pPr>
-        <w:spacing w:line="360" w:lineRule="auto" w:after="120"/>
+        <w:tabs>
+          <w:tab w:pos="9360" w:val="right" w:leader="dot"/>
+        </w:tabs>
+        <w:spacing w:line="312" w:lineRule="auto" w:after="80"/>
         <w:jc w:val="left"/>
       </w:pPr>
       <w:r>
         <w:rPr>
           <w:rFonts w:ascii="Times New Roman" w:hAnsi="Times New Roman"/>
           <w:b w:val="0"/>
-          <w:i w:val="0"/>
-          <w:sz w:val="24"/>
-        </w:rPr>
-        <w:t>Chapter 6: Discussion ........................................................................................................................ 38</w:t>
+          <w:sz w:val="22"/>
+        </w:rPr>
+        <w:t xml:space="preserve">    1.5 Scope and Deliverables</w:t>
+      </w:r>
+      <w:r>
+        <w:rPr>
+          <w:rFonts w:ascii="Times New Roman" w:hAnsi="Times New Roman"/>
+          <w:b w:val="0"/>
+          <w:sz w:val="22"/>
+        </w:rPr>
+        <w:tab/>
+        <w:t>5</w:t>
       </w:r>
     </w:p>
     <w:p>
       <w:pPr>
-        <w:spacing w:line="360" w:lineRule="auto" w:after="120"/>
+        <w:tabs>
+          <w:tab w:pos="9360" w:val="right" w:leader="dot"/>
+        </w:tabs>
+        <w:spacing w:line="312" w:lineRule="auto" w:after="80"/>
         <w:jc w:val="left"/>
       </w:pPr>
       <w:r>
         <w:rPr>
           <w:rFonts w:ascii="Times New Roman" w:hAnsi="Times New Roman"/>
           <w:b w:val="0"/>
-          <w:i w:val="0"/>
-          <w:sz w:val="24"/>
-        </w:rPr>
-        <w:t>Chapter 7: Conclusion and Future Work .................................................................................            44</w:t>
+          <w:sz w:val="22"/>
+        </w:rPr>
+        <w:t xml:space="preserve">    1.6 Report Structure</w:t>
+      </w:r>
+      <w:r>
+        <w:rPr>
+          <w:rFonts w:ascii="Times New Roman" w:hAnsi="Times New Roman"/>
+          <w:b w:val="0"/>
+          <w:sz w:val="22"/>
+        </w:rPr>
+        <w:tab/>
+        <w:t>6</w:t>
       </w:r>
     </w:p>
     <w:p>
       <w:pPr>
-        <w:spacing w:line="360" w:lineRule="auto" w:after="120"/>
+        <w:tabs>
+          <w:tab w:pos="9360" w:val="right" w:leader="dot"/>
+        </w:tabs>
+        <w:spacing w:line="312" w:lineRule="auto" w:after="80"/>
         <w:jc w:val="left"/>
       </w:pPr>
       <w:r>
         <w:rPr>
           <w:rFonts w:ascii="Times New Roman" w:hAnsi="Times New Roman"/>
-          <w:b w:val="0"/>
-          <w:i w:val="0"/>
-          <w:sz w:val="24"/>
-        </w:rPr>
-        <w:t>References .......................................................................................................................................... 48</w:t>
+          <w:b/>
+          <w:sz w:val="22"/>
+        </w:rPr>
+        <w:t>Chapter 2: Literature Review</w:t>
+      </w:r>
+      <w:r>
+        <w:rPr>
+          <w:rFonts w:ascii="Times New Roman" w:hAnsi="Times New Roman"/>
+          <w:b/>
+          <w:sz w:val="22"/>
+        </w:rPr>
+        <w:tab/>
+        <w:t>7</w:t>
       </w:r>
     </w:p>
     <w:p>
       <w:pPr>
-        <w:spacing w:line="360" w:lineRule="auto" w:after="120"/>
+        <w:tabs>
+          <w:tab w:pos="9360" w:val="right" w:leader="dot"/>
+        </w:tabs>
+        <w:spacing w:line="312" w:lineRule="auto" w:after="80"/>
         <w:jc w:val="left"/>
       </w:pPr>
       <w:r>
         <w:rPr>
           <w:rFonts w:ascii="Times New Roman" w:hAnsi="Times New Roman"/>
           <w:b w:val="0"/>
-          <w:i w:val="0"/>
-          <w:sz w:val="24"/>
-        </w:rPr>
-        <w:t>Appendices ......................................................................................................................................... 52</w:t>
+          <w:sz w:val="22"/>
+        </w:rPr>
+        <w:t xml:space="preserve">    2.1 IoT Security Landscape &amp; Threat Vectors</w:t>
+      </w:r>
+      <w:r>
+        <w:rPr>
+          <w:rFonts w:ascii="Times New Roman" w:hAnsi="Times New Roman"/>
+          <w:b w:val="0"/>
+          <w:sz w:val="22"/>
+        </w:rPr>
+        <w:tab/>
+        <w:t>7</w:t>
+      </w:r>
+    </w:p>
+    <w:p>
+      <w:pPr>
+        <w:tabs>
+          <w:tab w:pos="9360" w:val="right" w:leader="dot"/>
+        </w:tabs>
+        <w:spacing w:line="312" w:lineRule="auto" w:after="80"/>
+        <w:jc w:val="left"/>
+      </w:pPr>
+      <w:r>
+        <w:rPr>
+          <w:rFonts w:ascii="Times New Roman" w:hAnsi="Times New Roman"/>
+          <w:b w:val="0"/>
+          <w:sz w:val="22"/>
+        </w:rPr>
+        <w:t xml:space="preserve">    2.2 Evolution of Intrusion Detection Systems in IoT</w:t>
+      </w:r>
+      <w:r>
+        <w:rPr>
+          <w:rFonts w:ascii="Times New Roman" w:hAnsi="Times New Roman"/>
+          <w:b w:val="0"/>
+          <w:sz w:val="22"/>
+        </w:rPr>
+        <w:tab/>
+        <w:t>9</w:t>
+      </w:r>
+    </w:p>
+    <w:p>
+      <w:pPr>
+        <w:tabs>
+          <w:tab w:pos="9360" w:val="right" w:leader="dot"/>
+        </w:tabs>
+        <w:spacing w:line="312" w:lineRule="auto" w:after="80"/>
+        <w:jc w:val="left"/>
+      </w:pPr>
+      <w:r>
+        <w:rPr>
+          <w:rFonts w:ascii="Times New Roman" w:hAnsi="Times New Roman"/>
+          <w:b w:val="0"/>
+          <w:sz w:val="22"/>
+        </w:rPr>
+        <w:t xml:space="preserve">    2.3 Signature-Based Detection Systems (S-IDS)</w:t>
+      </w:r>
+      <w:r>
+        <w:rPr>
+          <w:rFonts w:ascii="Times New Roman" w:hAnsi="Times New Roman"/>
+          <w:b w:val="0"/>
+          <w:sz w:val="22"/>
+        </w:rPr>
+        <w:tab/>
+        <w:t>10</w:t>
+      </w:r>
+    </w:p>
+    <w:p>
+      <w:pPr>
+        <w:tabs>
+          <w:tab w:pos="9360" w:val="right" w:leader="dot"/>
+        </w:tabs>
+        <w:spacing w:line="312" w:lineRule="auto" w:after="80"/>
+        <w:jc w:val="left"/>
+      </w:pPr>
+      <w:r>
+        <w:rPr>
+          <w:rFonts w:ascii="Times New Roman" w:hAnsi="Times New Roman"/>
+          <w:b w:val="0"/>
+          <w:sz w:val="22"/>
+        </w:rPr>
+        <w:t xml:space="preserve">    2.4 Anomaly-Based Detection Systems (A-IDS)</w:t>
+      </w:r>
+      <w:r>
+        <w:rPr>
+          <w:rFonts w:ascii="Times New Roman" w:hAnsi="Times New Roman"/>
+          <w:b w:val="0"/>
+          <w:sz w:val="22"/>
+        </w:rPr>
+        <w:tab/>
+        <w:t>11</w:t>
+      </w:r>
+    </w:p>
+    <w:p>
+      <w:pPr>
+        <w:tabs>
+          <w:tab w:pos="9360" w:val="right" w:leader="dot"/>
+        </w:tabs>
+        <w:spacing w:line="312" w:lineRule="auto" w:after="80"/>
+        <w:jc w:val="left"/>
+      </w:pPr>
+      <w:r>
+        <w:rPr>
+          <w:rFonts w:ascii="Times New Roman" w:hAnsi="Times New Roman"/>
+          <w:b w:val="0"/>
+          <w:sz w:val="22"/>
+        </w:rPr>
+        <w:t xml:space="preserve">    2.5 Machine Learning Classifiers in Cyber Security</w:t>
+      </w:r>
+      <w:r>
+        <w:rPr>
+          <w:rFonts w:ascii="Times New Roman" w:hAnsi="Times New Roman"/>
+          <w:b w:val="0"/>
+          <w:sz w:val="22"/>
+        </w:rPr>
+        <w:tab/>
+        <w:t>12</w:t>
+      </w:r>
+    </w:p>
+    <w:p>
+      <w:pPr>
+        <w:tabs>
+          <w:tab w:pos="9360" w:val="right" w:leader="dot"/>
+        </w:tabs>
+        <w:spacing w:line="312" w:lineRule="auto" w:after="80"/>
+        <w:jc w:val="left"/>
+      </w:pPr>
+      <w:r>
+        <w:rPr>
+          <w:rFonts w:ascii="Times New Roman" w:hAnsi="Times New Roman"/>
+          <w:b w:val="0"/>
+          <w:sz w:val="22"/>
+        </w:rPr>
+        <w:t xml:space="preserve">    2.6 Hybrid IDS Frameworks &amp; Comparative Architectures</w:t>
+      </w:r>
+      <w:r>
+        <w:rPr>
+          <w:rFonts w:ascii="Times New Roman" w:hAnsi="Times New Roman"/>
+          <w:b w:val="0"/>
+          <w:sz w:val="22"/>
+        </w:rPr>
+        <w:tab/>
+        <w:t>13</w:t>
+      </w:r>
+    </w:p>
+    <w:p>
+      <w:pPr>
+        <w:tabs>
+          <w:tab w:pos="9360" w:val="right" w:leader="dot"/>
+        </w:tabs>
+        <w:spacing w:line="312" w:lineRule="auto" w:after="80"/>
+        <w:jc w:val="left"/>
+      </w:pPr>
+      <w:r>
+        <w:rPr>
+          <w:rFonts w:ascii="Times New Roman" w:hAnsi="Times New Roman"/>
+          <w:b w:val="0"/>
+          <w:sz w:val="22"/>
+        </w:rPr>
+        <w:t xml:space="preserve">    2.7 Feature Selection Methodologies</w:t>
+      </w:r>
+      <w:r>
+        <w:rPr>
+          <w:rFonts w:ascii="Times New Roman" w:hAnsi="Times New Roman"/>
+          <w:b w:val="0"/>
+          <w:sz w:val="22"/>
+        </w:rPr>
+        <w:tab/>
+        <w:t>14</w:t>
+      </w:r>
+    </w:p>
+    <w:p>
+      <w:pPr>
+        <w:tabs>
+          <w:tab w:pos="9360" w:val="right" w:leader="dot"/>
+        </w:tabs>
+        <w:spacing w:line="312" w:lineRule="auto" w:after="80"/>
+        <w:jc w:val="left"/>
+      </w:pPr>
+      <w:r>
+        <w:rPr>
+          <w:rFonts w:ascii="Times New Roman" w:hAnsi="Times New Roman"/>
+          <w:b w:val="0"/>
+          <w:sz w:val="22"/>
+        </w:rPr>
+        <w:t xml:space="preserve">    2.8 Mathematical Foundations of Machine Learning Classifiers</w:t>
+      </w:r>
+      <w:r>
+        <w:rPr>
+          <w:rFonts w:ascii="Times New Roman" w:hAnsi="Times New Roman"/>
+          <w:b w:val="0"/>
+          <w:sz w:val="22"/>
+        </w:rPr>
+        <w:tab/>
+        <w:t>14</w:t>
+      </w:r>
+    </w:p>
+    <w:p>
+      <w:pPr>
+        <w:tabs>
+          <w:tab w:pos="9360" w:val="right" w:leader="dot"/>
+        </w:tabs>
+        <w:spacing w:line="312" w:lineRule="auto" w:after="80"/>
+        <w:jc w:val="left"/>
+      </w:pPr>
+      <w:r>
+        <w:rPr>
+          <w:rFonts w:ascii="Times New Roman" w:hAnsi="Times New Roman"/>
+          <w:b w:val="0"/>
+          <w:sz w:val="22"/>
+        </w:rPr>
+        <w:t xml:space="preserve">    2.9 Research Gaps Identified</w:t>
+      </w:r>
+      <w:r>
+        <w:rPr>
+          <w:rFonts w:ascii="Times New Roman" w:hAnsi="Times New Roman"/>
+          <w:b w:val="0"/>
+          <w:sz w:val="22"/>
+        </w:rPr>
+        <w:tab/>
+        <w:t>15</w:t>
+      </w:r>
+    </w:p>
+    <w:p>
+      <w:pPr>
+        <w:tabs>
+          <w:tab w:pos="9360" w:val="right" w:leader="dot"/>
+        </w:tabs>
+        <w:spacing w:line="312" w:lineRule="auto" w:after="80"/>
+        <w:jc w:val="left"/>
+      </w:pPr>
+      <w:r>
+        <w:rPr>
+          <w:rFonts w:ascii="Times New Roman" w:hAnsi="Times New Roman"/>
+          <w:b/>
+          <w:sz w:val="22"/>
+        </w:rPr>
+        <w:t>Chapter 3: Methodology</w:t>
+      </w:r>
+      <w:r>
+        <w:rPr>
+          <w:rFonts w:ascii="Times New Roman" w:hAnsi="Times New Roman"/>
+          <w:b/>
+          <w:sz w:val="22"/>
+        </w:rPr>
+        <w:tab/>
+        <w:t>16</w:t>
+      </w:r>
+    </w:p>
+    <w:p>
+      <w:pPr>
+        <w:tabs>
+          <w:tab w:pos="9360" w:val="right" w:leader="dot"/>
+        </w:tabs>
+        <w:spacing w:line="312" w:lineRule="auto" w:after="80"/>
+        <w:jc w:val="left"/>
+      </w:pPr>
+      <w:r>
+        <w:rPr>
+          <w:rFonts w:ascii="Times New Roman" w:hAnsi="Times New Roman"/>
+          <w:b w:val="0"/>
+          <w:sz w:val="22"/>
+        </w:rPr>
+        <w:t xml:space="preserve">    3.1 Research Methodology &amp; System Design</w:t>
+      </w:r>
+      <w:r>
+        <w:rPr>
+          <w:rFonts w:ascii="Times New Roman" w:hAnsi="Times New Roman"/>
+          <w:b w:val="0"/>
+          <w:sz w:val="22"/>
+        </w:rPr>
+        <w:tab/>
+        <w:t>16</w:t>
+      </w:r>
+    </w:p>
+    <w:p>
+      <w:pPr>
+        <w:tabs>
+          <w:tab w:pos="9360" w:val="right" w:leader="dot"/>
+        </w:tabs>
+        <w:spacing w:line="312" w:lineRule="auto" w:after="80"/>
+        <w:jc w:val="left"/>
+      </w:pPr>
+      <w:r>
+        <w:rPr>
+          <w:rFonts w:ascii="Times New Roman" w:hAnsi="Times New Roman"/>
+          <w:b w:val="0"/>
+          <w:sz w:val="22"/>
+        </w:rPr>
+        <w:t xml:space="preserve">    3.2 System Architecture Overview</w:t>
+      </w:r>
+      <w:r>
+        <w:rPr>
+          <w:rFonts w:ascii="Times New Roman" w:hAnsi="Times New Roman"/>
+          <w:b w:val="0"/>
+          <w:sz w:val="22"/>
+        </w:rPr>
+        <w:tab/>
+        <w:t>17</w:t>
+      </w:r>
+    </w:p>
+    <w:p>
+      <w:pPr>
+        <w:tabs>
+          <w:tab w:pos="9360" w:val="right" w:leader="dot"/>
+        </w:tabs>
+        <w:spacing w:line="312" w:lineRule="auto" w:after="80"/>
+        <w:jc w:val="left"/>
+      </w:pPr>
+      <w:r>
+        <w:rPr>
+          <w:rFonts w:ascii="Times New Roman" w:hAnsi="Times New Roman"/>
+          <w:b w:val="0"/>
+          <w:sz w:val="22"/>
+        </w:rPr>
+        <w:t xml:space="preserve">    3.3 Phase 1: Signature Matching Engine Design</w:t>
+      </w:r>
+      <w:r>
+        <w:rPr>
+          <w:rFonts w:ascii="Times New Roman" w:hAnsi="Times New Roman"/>
+          <w:b w:val="0"/>
+          <w:sz w:val="22"/>
+        </w:rPr>
+        <w:tab/>
+        <w:t>18</w:t>
+      </w:r>
+    </w:p>
+    <w:p>
+      <w:pPr>
+        <w:tabs>
+          <w:tab w:pos="9360" w:val="right" w:leader="dot"/>
+        </w:tabs>
+        <w:spacing w:line="312" w:lineRule="auto" w:after="80"/>
+        <w:jc w:val="left"/>
+      </w:pPr>
+      <w:r>
+        <w:rPr>
+          <w:rFonts w:ascii="Times New Roman" w:hAnsi="Times New Roman"/>
+          <w:b w:val="0"/>
+          <w:sz w:val="22"/>
+        </w:rPr>
+        <w:t xml:space="preserve">    3.4 Phase 2: Machine Learning Anomaly Detector Design</w:t>
+      </w:r>
+      <w:r>
+        <w:rPr>
+          <w:rFonts w:ascii="Times New Roman" w:hAnsi="Times New Roman"/>
+          <w:b w:val="0"/>
+          <w:sz w:val="22"/>
+        </w:rPr>
+        <w:tab/>
+        <w:t>19</w:t>
+      </w:r>
+    </w:p>
+    <w:p>
+      <w:pPr>
+        <w:tabs>
+          <w:tab w:pos="9360" w:val="right" w:leader="dot"/>
+        </w:tabs>
+        <w:spacing w:line="312" w:lineRule="auto" w:after="80"/>
+        <w:jc w:val="left"/>
+      </w:pPr>
+      <w:r>
+        <w:rPr>
+          <w:rFonts w:ascii="Times New Roman" w:hAnsi="Times New Roman"/>
+          <w:b w:val="0"/>
+          <w:sz w:val="22"/>
+        </w:rPr>
+        <w:t xml:space="preserve">    3.5 3-Stage Feature Selection Pipeline</w:t>
+      </w:r>
+      <w:r>
+        <w:rPr>
+          <w:rFonts w:ascii="Times New Roman" w:hAnsi="Times New Roman"/>
+          <w:b w:val="0"/>
+          <w:sz w:val="22"/>
+        </w:rPr>
+        <w:tab/>
+        <w:t>20</w:t>
+      </w:r>
+    </w:p>
+    <w:p>
+      <w:pPr>
+        <w:tabs>
+          <w:tab w:pos="9360" w:val="right" w:leader="dot"/>
+        </w:tabs>
+        <w:spacing w:line="312" w:lineRule="auto" w:after="80"/>
+        <w:jc w:val="left"/>
+      </w:pPr>
+      <w:r>
+        <w:rPr>
+          <w:rFonts w:ascii="Times New Roman" w:hAnsi="Times New Roman"/>
+          <w:b w:val="0"/>
+          <w:sz w:val="22"/>
+        </w:rPr>
+        <w:t xml:space="preserve">    3.6 Evaluation Strategy &amp; Key Performance Metrics</w:t>
+      </w:r>
+      <w:r>
+        <w:rPr>
+          <w:rFonts w:ascii="Times New Roman" w:hAnsi="Times New Roman"/>
+          <w:b w:val="0"/>
+          <w:sz w:val="22"/>
+        </w:rPr>
+        <w:tab/>
+        <w:t>21</w:t>
+      </w:r>
+    </w:p>
+    <w:p>
+      <w:pPr>
+        <w:tabs>
+          <w:tab w:pos="9360" w:val="right" w:leader="dot"/>
+        </w:tabs>
+        <w:spacing w:line="312" w:lineRule="auto" w:after="80"/>
+        <w:jc w:val="left"/>
+      </w:pPr>
+      <w:r>
+        <w:rPr>
+          <w:rFonts w:ascii="Times New Roman" w:hAnsi="Times New Roman"/>
+          <w:b w:val="0"/>
+          <w:sz w:val="22"/>
+        </w:rPr>
+        <w:t xml:space="preserve">    3.7 Experimental Tools and Technology Stack</w:t>
+      </w:r>
+      <w:r>
+        <w:rPr>
+          <w:rFonts w:ascii="Times New Roman" w:hAnsi="Times New Roman"/>
+          <w:b w:val="0"/>
+          <w:sz w:val="22"/>
+        </w:rPr>
+        <w:tab/>
+        <w:t>23</w:t>
+      </w:r>
+    </w:p>
+    <w:p>
+      <w:pPr>
+        <w:tabs>
+          <w:tab w:pos="9360" w:val="right" w:leader="dot"/>
+        </w:tabs>
+        <w:spacing w:line="312" w:lineRule="auto" w:after="80"/>
+        <w:jc w:val="left"/>
+      </w:pPr>
+      <w:r>
+        <w:rPr>
+          <w:rFonts w:ascii="Times New Roman" w:hAnsi="Times New Roman"/>
+          <w:b/>
+          <w:sz w:val="22"/>
+        </w:rPr>
+        <w:t>Chapter 4: Implementation</w:t>
+      </w:r>
+      <w:r>
+        <w:rPr>
+          <w:rFonts w:ascii="Times New Roman" w:hAnsi="Times New Roman"/>
+          <w:b/>
+          <w:sz w:val="22"/>
+        </w:rPr>
+        <w:tab/>
+        <w:t>24</w:t>
+      </w:r>
+    </w:p>
+    <w:p>
+      <w:pPr>
+        <w:tabs>
+          <w:tab w:pos="9360" w:val="right" w:leader="dot"/>
+        </w:tabs>
+        <w:spacing w:line="312" w:lineRule="auto" w:after="80"/>
+        <w:jc w:val="left"/>
+      </w:pPr>
+      <w:r>
+        <w:rPr>
+          <w:rFonts w:ascii="Times New Roman" w:hAnsi="Times New Roman"/>
+          <w:b w:val="0"/>
+          <w:sz w:val="22"/>
+        </w:rPr>
+        <w:t xml:space="preserve">    4.1 Development Environment &amp; Specifications</w:t>
+      </w:r>
+      <w:r>
+        <w:rPr>
+          <w:rFonts w:ascii="Times New Roman" w:hAnsi="Times New Roman"/>
+          <w:b w:val="0"/>
+          <w:sz w:val="22"/>
+        </w:rPr>
+        <w:tab/>
+        <w:t>24</w:t>
+      </w:r>
+    </w:p>
+    <w:p>
+      <w:pPr>
+        <w:tabs>
+          <w:tab w:pos="9360" w:val="right" w:leader="dot"/>
+        </w:tabs>
+        <w:spacing w:line="312" w:lineRule="auto" w:after="80"/>
+        <w:jc w:val="left"/>
+      </w:pPr>
+      <w:r>
+        <w:rPr>
+          <w:rFonts w:ascii="Times New Roman" w:hAnsi="Times New Roman"/>
+          <w:b w:val="0"/>
+          <w:sz w:val="22"/>
+        </w:rPr>
+        <w:t xml:space="preserve">    4.2 Dataset Acquisition &amp; Benchmark Preprocessing</w:t>
+      </w:r>
+      <w:r>
+        <w:rPr>
+          <w:rFonts w:ascii="Times New Roman" w:hAnsi="Times New Roman"/>
+          <w:b w:val="0"/>
+          <w:sz w:val="22"/>
+        </w:rPr>
+        <w:tab/>
+        <w:t>25</w:t>
+      </w:r>
+    </w:p>
+    <w:p>
+      <w:pPr>
+        <w:tabs>
+          <w:tab w:pos="9360" w:val="right" w:leader="dot"/>
+        </w:tabs>
+        <w:spacing w:line="312" w:lineRule="auto" w:after="80"/>
+        <w:jc w:val="left"/>
+      </w:pPr>
+      <w:r>
+        <w:rPr>
+          <w:rFonts w:ascii="Times New Roman" w:hAnsi="Times New Roman"/>
+          <w:b w:val="0"/>
+          <w:sz w:val="22"/>
+        </w:rPr>
+        <w:t xml:space="preserve">    4.3 Data Preprocessing &amp; Min-Max Normalization</w:t>
+      </w:r>
+      <w:r>
+        <w:rPr>
+          <w:rFonts w:ascii="Times New Roman" w:hAnsi="Times New Roman"/>
+          <w:b w:val="0"/>
+          <w:sz w:val="22"/>
+        </w:rPr>
+        <w:tab/>
+        <w:t>26</w:t>
+      </w:r>
+    </w:p>
+    <w:p>
+      <w:pPr>
+        <w:tabs>
+          <w:tab w:pos="9360" w:val="right" w:leader="dot"/>
+        </w:tabs>
+        <w:spacing w:line="312" w:lineRule="auto" w:after="80"/>
+        <w:jc w:val="left"/>
+      </w:pPr>
+      <w:r>
+        <w:rPr>
+          <w:rFonts w:ascii="Times New Roman" w:hAnsi="Times New Roman"/>
+          <w:b w:val="0"/>
+          <w:sz w:val="22"/>
+        </w:rPr>
+        <w:t xml:space="preserve">    4.4 Feature Selection Pipeline Implementation</w:t>
+      </w:r>
+      <w:r>
+        <w:rPr>
+          <w:rFonts w:ascii="Times New Roman" w:hAnsi="Times New Roman"/>
+          <w:b w:val="0"/>
+          <w:sz w:val="22"/>
+        </w:rPr>
+        <w:tab/>
+        <w:t>27</w:t>
+      </w:r>
+    </w:p>
+    <w:p>
+      <w:pPr>
+        <w:tabs>
+          <w:tab w:pos="9360" w:val="right" w:leader="dot"/>
+        </w:tabs>
+        <w:spacing w:line="312" w:lineRule="auto" w:after="80"/>
+        <w:jc w:val="left"/>
+      </w:pPr>
+      <w:r>
+        <w:rPr>
+          <w:rFonts w:ascii="Times New Roman" w:hAnsi="Times New Roman"/>
+          <w:b w:val="0"/>
+          <w:sz w:val="22"/>
+        </w:rPr>
+        <w:t xml:space="preserve">    4.5 Signature Rules Engine Implementation</w:t>
+      </w:r>
+      <w:r>
+        <w:rPr>
+          <w:rFonts w:ascii="Times New Roman" w:hAnsi="Times New Roman"/>
+          <w:b w:val="0"/>
+          <w:sz w:val="22"/>
+        </w:rPr>
+        <w:tab/>
+        <w:t>27</w:t>
+      </w:r>
+    </w:p>
+    <w:p>
+      <w:pPr>
+        <w:tabs>
+          <w:tab w:pos="9360" w:val="right" w:leader="dot"/>
+        </w:tabs>
+        <w:spacing w:line="312" w:lineRule="auto" w:after="80"/>
+        <w:jc w:val="left"/>
+      </w:pPr>
+      <w:r>
+        <w:rPr>
+          <w:rFonts w:ascii="Times New Roman" w:hAnsi="Times New Roman"/>
+          <w:b w:val="0"/>
+          <w:sz w:val="22"/>
+        </w:rPr>
+        <w:t xml:space="preserve">    4.6 Machine Learning Model Training &amp; Optimization</w:t>
+      </w:r>
+      <w:r>
+        <w:rPr>
+          <w:rFonts w:ascii="Times New Roman" w:hAnsi="Times New Roman"/>
+          <w:b w:val="0"/>
+          <w:sz w:val="22"/>
+        </w:rPr>
+        <w:tab/>
+        <w:t>28</w:t>
+      </w:r>
+    </w:p>
+    <w:p>
+      <w:pPr>
+        <w:tabs>
+          <w:tab w:pos="9360" w:val="right" w:leader="dot"/>
+        </w:tabs>
+        <w:spacing w:line="312" w:lineRule="auto" w:after="80"/>
+        <w:jc w:val="left"/>
+      </w:pPr>
+      <w:r>
+        <w:rPr>
+          <w:rFonts w:ascii="Times New Roman" w:hAnsi="Times New Roman"/>
+          <w:b w:val="0"/>
+          <w:sz w:val="22"/>
+        </w:rPr>
+        <w:t xml:space="preserve">    4.7 Hybrid Coordination Engine Implementation</w:t>
+      </w:r>
+      <w:r>
+        <w:rPr>
+          <w:rFonts w:ascii="Times New Roman" w:hAnsi="Times New Roman"/>
+          <w:b w:val="0"/>
+          <w:sz w:val="22"/>
+        </w:rPr>
+        <w:tab/>
+        <w:t>29</w:t>
+      </w:r>
+    </w:p>
+    <w:p>
+      <w:pPr>
+        <w:tabs>
+          <w:tab w:pos="9360" w:val="right" w:leader="dot"/>
+        </w:tabs>
+        <w:spacing w:line="312" w:lineRule="auto" w:after="80"/>
+        <w:jc w:val="left"/>
+      </w:pPr>
+      <w:r>
+        <w:rPr>
+          <w:rFonts w:ascii="Times New Roman" w:hAnsi="Times New Roman"/>
+          <w:b w:val="0"/>
+          <w:sz w:val="22"/>
+        </w:rPr>
+        <w:t xml:space="preserve">    4.8 Verification &amp; Hardware Performance Tracking</w:t>
+      </w:r>
+      <w:r>
+        <w:rPr>
+          <w:rFonts w:ascii="Times New Roman" w:hAnsi="Times New Roman"/>
+          <w:b w:val="0"/>
+          <w:sz w:val="22"/>
+        </w:rPr>
+        <w:tab/>
+        <w:t>29</w:t>
+      </w:r>
+    </w:p>
+    <w:p>
+      <w:pPr>
+        <w:tabs>
+          <w:tab w:pos="9360" w:val="right" w:leader="dot"/>
+        </w:tabs>
+        <w:spacing w:line="312" w:lineRule="auto" w:after="80"/>
+        <w:jc w:val="left"/>
+      </w:pPr>
+      <w:r>
+        <w:rPr>
+          <w:rFonts w:ascii="Times New Roman" w:hAnsi="Times New Roman"/>
+          <w:b w:val="0"/>
+          <w:sz w:val="22"/>
+        </w:rPr>
+        <w:t xml:space="preserve">    4.9 Software Package Modularity &amp; Clean Architecture</w:t>
+      </w:r>
+      <w:r>
+        <w:rPr>
+          <w:rFonts w:ascii="Times New Roman" w:hAnsi="Times New Roman"/>
+          <w:b w:val="0"/>
+          <w:sz w:val="22"/>
+        </w:rPr>
+        <w:tab/>
+        <w:t>30</w:t>
+      </w:r>
+    </w:p>
+    <w:p>
+      <w:pPr>
+        <w:tabs>
+          <w:tab w:pos="9360" w:val="right" w:leader="dot"/>
+        </w:tabs>
+        <w:spacing w:line="312" w:lineRule="auto" w:after="80"/>
+        <w:jc w:val="left"/>
+      </w:pPr>
+      <w:r>
+        <w:rPr>
+          <w:rFonts w:ascii="Times New Roman" w:hAnsi="Times New Roman"/>
+          <w:b/>
+          <w:sz w:val="22"/>
+        </w:rPr>
+        <w:t>Chapter 5: Results and Evaluation</w:t>
+      </w:r>
+      <w:r>
+        <w:rPr>
+          <w:rFonts w:ascii="Times New Roman" w:hAnsi="Times New Roman"/>
+          <w:b/>
+          <w:sz w:val="22"/>
+        </w:rPr>
+        <w:tab/>
+        <w:t>31</w:t>
+      </w:r>
+    </w:p>
+    <w:p>
+      <w:pPr>
+        <w:tabs>
+          <w:tab w:pos="9360" w:val="right" w:leader="dot"/>
+        </w:tabs>
+        <w:spacing w:line="312" w:lineRule="auto" w:after="80"/>
+        <w:jc w:val="left"/>
+      </w:pPr>
+      <w:r>
+        <w:rPr>
+          <w:rFonts w:ascii="Times New Roman" w:hAnsi="Times New Roman"/>
+          <w:b w:val="0"/>
+          <w:sz w:val="22"/>
+        </w:rPr>
+        <w:t xml:space="preserve">    5.1 Stage 2 Feature Selection Outcomes</w:t>
+      </w:r>
+      <w:r>
+        <w:rPr>
+          <w:rFonts w:ascii="Times New Roman" w:hAnsi="Times New Roman"/>
+          <w:b w:val="0"/>
+          <w:sz w:val="22"/>
+        </w:rPr>
+        <w:tab/>
+        <w:t>31</w:t>
+      </w:r>
+    </w:p>
+    <w:p>
+      <w:pPr>
+        <w:tabs>
+          <w:tab w:pos="9360" w:val="right" w:leader="dot"/>
+        </w:tabs>
+        <w:spacing w:line="312" w:lineRule="auto" w:after="80"/>
+        <w:jc w:val="left"/>
+      </w:pPr>
+      <w:r>
+        <w:rPr>
+          <w:rFonts w:ascii="Times New Roman" w:hAnsi="Times New Roman"/>
+          <w:b w:val="0"/>
+          <w:sz w:val="22"/>
+        </w:rPr>
+        <w:t xml:space="preserve">    5.2 Phase 2 Classifier Comparative Analysis</w:t>
+      </w:r>
+      <w:r>
+        <w:rPr>
+          <w:rFonts w:ascii="Times New Roman" w:hAnsi="Times New Roman"/>
+          <w:b w:val="0"/>
+          <w:sz w:val="22"/>
+        </w:rPr>
+        <w:tab/>
+        <w:t>32</w:t>
+      </w:r>
+    </w:p>
+    <w:p>
+      <w:pPr>
+        <w:tabs>
+          <w:tab w:pos="9360" w:val="right" w:leader="dot"/>
+        </w:tabs>
+        <w:spacing w:line="312" w:lineRule="auto" w:after="80"/>
+        <w:jc w:val="left"/>
+      </w:pPr>
+      <w:r>
+        <w:rPr>
+          <w:rFonts w:ascii="Times New Roman" w:hAnsi="Times New Roman"/>
+          <w:b w:val="0"/>
+          <w:sz w:val="22"/>
+        </w:rPr>
+        <w:t xml:space="preserve">    5.3 Hybrid IDS Performance Evaluation</w:t>
+      </w:r>
+      <w:r>
+        <w:rPr>
+          <w:rFonts w:ascii="Times New Roman" w:hAnsi="Times New Roman"/>
+          <w:b w:val="0"/>
+          <w:sz w:val="22"/>
+        </w:rPr>
+        <w:tab/>
+        <w:t>33</w:t>
+      </w:r>
+    </w:p>
+    <w:p>
+      <w:pPr>
+        <w:tabs>
+          <w:tab w:pos="9360" w:val="right" w:leader="dot"/>
+        </w:tabs>
+        <w:spacing w:line="312" w:lineRule="auto" w:after="80"/>
+        <w:jc w:val="left"/>
+      </w:pPr>
+      <w:r>
+        <w:rPr>
+          <w:rFonts w:ascii="Times New Roman" w:hAnsi="Times New Roman"/>
+          <w:b w:val="0"/>
+          <w:sz w:val="22"/>
+        </w:rPr>
+        <w:t xml:space="preserve">    5.4 Resource Consumption &amp; Processing Overhead</w:t>
+      </w:r>
+      <w:r>
+        <w:rPr>
+          <w:rFonts w:ascii="Times New Roman" w:hAnsi="Times New Roman"/>
+          <w:b w:val="0"/>
+          <w:sz w:val="22"/>
+        </w:rPr>
+        <w:tab/>
+        <w:t>35</w:t>
+      </w:r>
+    </w:p>
+    <w:p>
+      <w:pPr>
+        <w:tabs>
+          <w:tab w:pos="9360" w:val="right" w:leader="dot"/>
+        </w:tabs>
+        <w:spacing w:line="312" w:lineRule="auto" w:after="80"/>
+        <w:jc w:val="left"/>
+      </w:pPr>
+      <w:r>
+        <w:rPr>
+          <w:rFonts w:ascii="Times New Roman" w:hAnsi="Times New Roman"/>
+          <w:b w:val="0"/>
+          <w:sz w:val="22"/>
+        </w:rPr>
+        <w:t xml:space="preserve">    5.5 Zero-Day Attack Detection Simulation</w:t>
+      </w:r>
+      <w:r>
+        <w:rPr>
+          <w:rFonts w:ascii="Times New Roman" w:hAnsi="Times New Roman"/>
+          <w:b w:val="0"/>
+          <w:sz w:val="22"/>
+        </w:rPr>
+        <w:tab/>
+        <w:t>36</w:t>
+      </w:r>
+    </w:p>
+    <w:p>
+      <w:pPr>
+        <w:tabs>
+          <w:tab w:pos="9360" w:val="right" w:leader="dot"/>
+        </w:tabs>
+        <w:spacing w:line="312" w:lineRule="auto" w:after="80"/>
+        <w:jc w:val="left"/>
+      </w:pPr>
+      <w:r>
+        <w:rPr>
+          <w:rFonts w:ascii="Times New Roman" w:hAnsi="Times New Roman"/>
+          <w:b/>
+          <w:sz w:val="22"/>
+        </w:rPr>
+        <w:t>Chapter 6: Discussion</w:t>
+      </w:r>
+      <w:r>
+        <w:rPr>
+          <w:rFonts w:ascii="Times New Roman" w:hAnsi="Times New Roman"/>
+          <w:b/>
+          <w:sz w:val="22"/>
+        </w:rPr>
+        <w:tab/>
+        <w:t>38</w:t>
+      </w:r>
+    </w:p>
+    <w:p>
+      <w:pPr>
+        <w:tabs>
+          <w:tab w:pos="9360" w:val="right" w:leader="dot"/>
+        </w:tabs>
+        <w:spacing w:line="312" w:lineRule="auto" w:after="80"/>
+        <w:jc w:val="left"/>
+      </w:pPr>
+      <w:r>
+        <w:rPr>
+          <w:rFonts w:ascii="Times New Roman" w:hAnsi="Times New Roman"/>
+          <w:b w:val="0"/>
+          <w:sz w:val="22"/>
+        </w:rPr>
+        <w:t xml:space="preserve">    6.1 Critical Interpretation of Empirical Findings</w:t>
+      </w:r>
+      <w:r>
+        <w:rPr>
+          <w:rFonts w:ascii="Times New Roman" w:hAnsi="Times New Roman"/>
+          <w:b w:val="0"/>
+          <w:sz w:val="22"/>
+        </w:rPr>
+        <w:tab/>
+        <w:t>38</w:t>
+      </w:r>
+    </w:p>
+    <w:p>
+      <w:pPr>
+        <w:tabs>
+          <w:tab w:pos="9360" w:val="right" w:leader="dot"/>
+        </w:tabs>
+        <w:spacing w:line="312" w:lineRule="auto" w:after="80"/>
+        <w:jc w:val="left"/>
+      </w:pPr>
+      <w:r>
+        <w:rPr>
+          <w:rFonts w:ascii="Times New Roman" w:hAnsi="Times New Roman"/>
+          <w:b w:val="0"/>
+          <w:sz w:val="22"/>
+        </w:rPr>
+        <w:t xml:space="preserve">    6.2 Trade-off Analysis: Speed vs. Detection Generalization</w:t>
+      </w:r>
+      <w:r>
+        <w:rPr>
+          <w:rFonts w:ascii="Times New Roman" w:hAnsi="Times New Roman"/>
+          <w:b w:val="0"/>
+          <w:sz w:val="22"/>
+        </w:rPr>
+        <w:tab/>
+        <w:t>39</w:t>
+      </w:r>
+    </w:p>
+    <w:p>
+      <w:pPr>
+        <w:tabs>
+          <w:tab w:pos="9360" w:val="right" w:leader="dot"/>
+        </w:tabs>
+        <w:spacing w:line="312" w:lineRule="auto" w:after="80"/>
+        <w:jc w:val="left"/>
+      </w:pPr>
+      <w:r>
+        <w:rPr>
+          <w:rFonts w:ascii="Times New Roman" w:hAnsi="Times New Roman"/>
+          <w:b w:val="0"/>
+          <w:sz w:val="22"/>
+        </w:rPr>
+        <w:t xml:space="preserve">    6.3 Comparison with Benchmark Literature</w:t>
+      </w:r>
+      <w:r>
+        <w:rPr>
+          <w:rFonts w:ascii="Times New Roman" w:hAnsi="Times New Roman"/>
+          <w:b w:val="0"/>
+          <w:sz w:val="22"/>
+        </w:rPr>
+        <w:tab/>
+        <w:t>40</w:t>
+      </w:r>
+    </w:p>
+    <w:p>
+      <w:pPr>
+        <w:tabs>
+          <w:tab w:pos="9360" w:val="right" w:leader="dot"/>
+        </w:tabs>
+        <w:spacing w:line="312" w:lineRule="auto" w:after="80"/>
+        <w:jc w:val="left"/>
+      </w:pPr>
+      <w:r>
+        <w:rPr>
+          <w:rFonts w:ascii="Times New Roman" w:hAnsi="Times New Roman"/>
+          <w:b w:val="0"/>
+          <w:sz w:val="22"/>
+        </w:rPr>
+        <w:t xml:space="preserve">    6.4 Limitations &amp; Evasion Vulnerabilities</w:t>
+      </w:r>
+      <w:r>
+        <w:rPr>
+          <w:rFonts w:ascii="Times New Roman" w:hAnsi="Times New Roman"/>
+          <w:b w:val="0"/>
+          <w:sz w:val="22"/>
+        </w:rPr>
+        <w:tab/>
+        <w:t>41</w:t>
+      </w:r>
+    </w:p>
+    <w:p>
+      <w:pPr>
+        <w:tabs>
+          <w:tab w:pos="9360" w:val="right" w:leader="dot"/>
+        </w:tabs>
+        <w:spacing w:line="312" w:lineRule="auto" w:after="80"/>
+        <w:jc w:val="left"/>
+      </w:pPr>
+      <w:r>
+        <w:rPr>
+          <w:rFonts w:ascii="Times New Roman" w:hAnsi="Times New Roman"/>
+          <w:b w:val="0"/>
+          <w:sz w:val="22"/>
+        </w:rPr>
+        <w:t xml:space="preserve">    6.5 Practical IoT Edge Deployment Considerations</w:t>
+      </w:r>
+      <w:r>
+        <w:rPr>
+          <w:rFonts w:ascii="Times New Roman" w:hAnsi="Times New Roman"/>
+          <w:b w:val="0"/>
+          <w:sz w:val="22"/>
+        </w:rPr>
+        <w:tab/>
+        <w:t>42</w:t>
+      </w:r>
+    </w:p>
+    <w:p>
+      <w:pPr>
+        <w:tabs>
+          <w:tab w:pos="9360" w:val="right" w:leader="dot"/>
+        </w:tabs>
+        <w:spacing w:line="312" w:lineRule="auto" w:after="80"/>
+        <w:jc w:val="left"/>
+      </w:pPr>
+      <w:r>
+        <w:rPr>
+          <w:rFonts w:ascii="Times New Roman" w:hAnsi="Times New Roman"/>
+          <w:b/>
+          <w:sz w:val="22"/>
+        </w:rPr>
+        <w:t>Chapter 7: Conclusion and Future Work</w:t>
+      </w:r>
+      <w:r>
+        <w:rPr>
+          <w:rFonts w:ascii="Times New Roman" w:hAnsi="Times New Roman"/>
+          <w:b/>
+          <w:sz w:val="22"/>
+        </w:rPr>
+        <w:tab/>
+        <w:t>44</w:t>
+      </w:r>
+    </w:p>
+    <w:p>
+      <w:pPr>
+        <w:tabs>
+          <w:tab w:pos="9360" w:val="right" w:leader="dot"/>
+        </w:tabs>
+        <w:spacing w:line="312" w:lineRule="auto" w:after="80"/>
+        <w:jc w:val="left"/>
+      </w:pPr>
+      <w:r>
+        <w:rPr>
+          <w:rFonts w:ascii="Times New Roman" w:hAnsi="Times New Roman"/>
+          <w:b w:val="0"/>
+          <w:sz w:val="22"/>
+        </w:rPr>
+        <w:t xml:space="preserve">    7.1 Summary of Project Achievements</w:t>
+      </w:r>
+      <w:r>
+        <w:rPr>
+          <w:rFonts w:ascii="Times New Roman" w:hAnsi="Times New Roman"/>
+          <w:b w:val="0"/>
+          <w:sz w:val="22"/>
+        </w:rPr>
+        <w:tab/>
+        <w:t>44</w:t>
+      </w:r>
+    </w:p>
+    <w:p>
+      <w:pPr>
+        <w:tabs>
+          <w:tab w:pos="9360" w:val="right" w:leader="dot"/>
+        </w:tabs>
+        <w:spacing w:line="312" w:lineRule="auto" w:after="80"/>
+        <w:jc w:val="left"/>
+      </w:pPr>
+      <w:r>
+        <w:rPr>
+          <w:rFonts w:ascii="Times New Roman" w:hAnsi="Times New Roman"/>
+          <w:b w:val="0"/>
+          <w:sz w:val="22"/>
+        </w:rPr>
+        <w:t xml:space="preserve">    7.2 Fulfillment of Research Objectives</w:t>
+      </w:r>
+      <w:r>
+        <w:rPr>
+          <w:rFonts w:ascii="Times New Roman" w:hAnsi="Times New Roman"/>
+          <w:b w:val="0"/>
+          <w:sz w:val="22"/>
+        </w:rPr>
+        <w:tab/>
+        <w:t>44</w:t>
+      </w:r>
+    </w:p>
+    <w:p>
+      <w:pPr>
+        <w:tabs>
+          <w:tab w:pos="9360" w:val="right" w:leader="dot"/>
+        </w:tabs>
+        <w:spacing w:line="312" w:lineRule="auto" w:after="80"/>
+        <w:jc w:val="left"/>
+      </w:pPr>
+      <w:r>
+        <w:rPr>
+          <w:rFonts w:ascii="Times New Roman" w:hAnsi="Times New Roman"/>
+          <w:b w:val="0"/>
+          <w:sz w:val="22"/>
+        </w:rPr>
+        <w:t xml:space="preserve">    7.3 Key Theoretical and Practical Contributions</w:t>
+      </w:r>
+      <w:r>
+        <w:rPr>
+          <w:rFonts w:ascii="Times New Roman" w:hAnsi="Times New Roman"/>
+          <w:b w:val="0"/>
+          <w:sz w:val="22"/>
+        </w:rPr>
+        <w:tab/>
+        <w:t>46</w:t>
+      </w:r>
+    </w:p>
+    <w:p>
+      <w:pPr>
+        <w:tabs>
+          <w:tab w:pos="9360" w:val="right" w:leader="dot"/>
+        </w:tabs>
+        <w:spacing w:line="312" w:lineRule="auto" w:after="80"/>
+        <w:jc w:val="left"/>
+      </w:pPr>
+      <w:r>
+        <w:rPr>
+          <w:rFonts w:ascii="Times New Roman" w:hAnsi="Times New Roman"/>
+          <w:b w:val="0"/>
+          <w:sz w:val="22"/>
+        </w:rPr>
+        <w:t xml:space="preserve">    7.4 Future Research Directions</w:t>
+      </w:r>
+      <w:r>
+        <w:rPr>
+          <w:rFonts w:ascii="Times New Roman" w:hAnsi="Times New Roman"/>
+          <w:b w:val="0"/>
+          <w:sz w:val="22"/>
+        </w:rPr>
+        <w:tab/>
+        <w:t>46</w:t>
+      </w:r>
+    </w:p>
+    <w:p>
+      <w:pPr>
+        <w:tabs>
+          <w:tab w:pos="9360" w:val="right" w:leader="dot"/>
+        </w:tabs>
+        <w:spacing w:line="312" w:lineRule="auto" w:after="80"/>
+        <w:jc w:val="left"/>
+      </w:pPr>
+      <w:r>
+        <w:rPr>
+          <w:rFonts w:ascii="Times New Roman" w:hAnsi="Times New Roman"/>
+          <w:b w:val="0"/>
+          <w:sz w:val="22"/>
+        </w:rPr>
+        <w:t xml:space="preserve">    7.5 Final Concluding Remarks</w:t>
+      </w:r>
+      <w:r>
+        <w:rPr>
+          <w:rFonts w:ascii="Times New Roman" w:hAnsi="Times New Roman"/>
+          <w:b w:val="0"/>
+          <w:sz w:val="22"/>
+        </w:rPr>
+        <w:tab/>
+        <w:t>47</w:t>
+      </w:r>
+    </w:p>
+    <w:p>
+      <w:pPr>
+        <w:tabs>
+          <w:tab w:pos="9360" w:val="right" w:leader="dot"/>
+        </w:tabs>
+        <w:spacing w:line="312" w:lineRule="auto" w:after="80"/>
+        <w:jc w:val="left"/>
+      </w:pPr>
+      <w:r>
+        <w:rPr>
+          <w:rFonts w:ascii="Times New Roman" w:hAnsi="Times New Roman"/>
+          <w:b/>
+          <w:sz w:val="22"/>
+        </w:rPr>
+        <w:t>References</w:t>
+      </w:r>
+      <w:r>
+        <w:rPr>
+          <w:rFonts w:ascii="Times New Roman" w:hAnsi="Times New Roman"/>
+          <w:b/>
+          <w:sz w:val="22"/>
+        </w:rPr>
+        <w:tab/>
+        <w:t>48</w:t>
+      </w:r>
+    </w:p>
+    <w:p>
+      <w:pPr>
+        <w:tabs>
+          <w:tab w:pos="9360" w:val="right" w:leader="dot"/>
+        </w:tabs>
+        <w:spacing w:line="312" w:lineRule="auto" w:after="80"/>
+        <w:jc w:val="left"/>
+      </w:pPr>
+      <w:r>
+        <w:rPr>
+          <w:rFonts w:ascii="Times New Roman" w:hAnsi="Times New Roman"/>
+          <w:b/>
+          <w:sz w:val="22"/>
+        </w:rPr>
+        <w:t>Appendices</w:t>
+      </w:r>
+      <w:r>
+        <w:rPr>
+          <w:rFonts w:ascii="Times New Roman" w:hAnsi="Times New Roman"/>
+          <w:b/>
+          <w:sz w:val="22"/>
+        </w:rPr>
+        <w:tab/>
+        <w:t>52</w:t>
+      </w:r>
+    </w:p>
+    <w:p>
+      <w:r>
+        <w:br w:type="page"/>
       </w:r>
     </w:p>
     <w:p>
@@ -808,122 +2185,215 @@
     </w:p>
     <w:p>
       <w:pPr>
-        <w:spacing w:line="360" w:lineRule="auto" w:after="120"/>
+        <w:tabs>
+          <w:tab w:pos="9360" w:val="right" w:leader="dot"/>
+        </w:tabs>
+        <w:spacing w:line="312" w:lineRule="auto" w:after="80"/>
         <w:jc w:val="left"/>
       </w:pPr>
       <w:r>
         <w:rPr>
           <w:rFonts w:ascii="Times New Roman" w:hAnsi="Times New Roman"/>
           <w:b w:val="0"/>
-          <w:i w:val="0"/>
-          <w:sz w:val="24"/>
-        </w:rPr>
-        <w:t>Figure 3.1: Two-Tier Sequential Hybrid Intrusion Detection System Architectural Dataflow ....... 18</w:t>
+          <w:sz w:val="22"/>
+        </w:rPr>
+        <w:t>Figure 3.1: Two-Tier Sequential Hybrid Intrusion Detection System Architectural Dataflow</w:t>
+      </w:r>
+      <w:r>
+        <w:rPr>
+          <w:rFonts w:ascii="Times New Roman" w:hAnsi="Times New Roman"/>
+          <w:b w:val="0"/>
+          <w:sz w:val="22"/>
+        </w:rPr>
+        <w:tab/>
+        <w:t>18</w:t>
       </w:r>
     </w:p>
     <w:p>
       <w:pPr>
-        <w:spacing w:line="360" w:lineRule="auto" w:after="120"/>
+        <w:tabs>
+          <w:tab w:pos="9360" w:val="right" w:leader="dot"/>
+        </w:tabs>
+        <w:spacing w:line="312" w:lineRule="auto" w:after="80"/>
         <w:jc w:val="left"/>
       </w:pPr>
       <w:r>
         <w:rPr>
           <w:rFonts w:ascii="Times New Roman" w:hAnsi="Times New Roman"/>
           <w:b w:val="0"/>
-          <w:i w:val="0"/>
-          <w:sz w:val="24"/>
-        </w:rPr>
-        <w:t>Figure 5.1: Random Forest Feature Importance Ranking across 8 Selected Features ................... 32</w:t>
+          <w:sz w:val="22"/>
+        </w:rPr>
+        <w:t>Figure 5.1: Random Forest Feature Importance Ranking across 8 Selected Features</w:t>
+      </w:r>
+      <w:r>
+        <w:rPr>
+          <w:rFonts w:ascii="Times New Roman" w:hAnsi="Times New Roman"/>
+          <w:b w:val="0"/>
+          <w:sz w:val="22"/>
+        </w:rPr>
+        <w:tab/>
+        <w:t>32</w:t>
       </w:r>
     </w:p>
     <w:p>
       <w:pPr>
-        <w:spacing w:line="360" w:lineRule="auto" w:after="120"/>
+        <w:tabs>
+          <w:tab w:pos="9360" w:val="right" w:leader="dot"/>
+        </w:tabs>
+        <w:spacing w:line="312" w:lineRule="auto" w:after="80"/>
         <w:jc w:val="left"/>
       </w:pPr>
       <w:r>
         <w:rPr>
           <w:rFonts w:ascii="Times New Roman" w:hAnsi="Times New Roman"/>
           <w:b w:val="0"/>
-          <w:i w:val="0"/>
-          <w:sz w:val="24"/>
-        </w:rPr>
-        <w:t>Figure 5.2: Machine Learning Classifiers Benchmark Performance Comparison Bar Chart .......... 33</w:t>
+          <w:sz w:val="22"/>
+        </w:rPr>
+        <w:t>Figure 5.2: Machine Learning Classifiers Benchmark Performance Comparison Bar Chart</w:t>
+      </w:r>
+      <w:r>
+        <w:rPr>
+          <w:rFonts w:ascii="Times New Roman" w:hAnsi="Times New Roman"/>
+          <w:b w:val="0"/>
+          <w:sz w:val="22"/>
+        </w:rPr>
+        <w:tab/>
+        <w:t>33</w:t>
       </w:r>
     </w:p>
     <w:p>
       <w:pPr>
-        <w:spacing w:line="360" w:lineRule="auto" w:after="120"/>
+        <w:tabs>
+          <w:tab w:pos="9360" w:val="right" w:leader="dot"/>
+        </w:tabs>
+        <w:spacing w:line="312" w:lineRule="auto" w:after="80"/>
         <w:jc w:val="left"/>
       </w:pPr>
       <w:r>
         <w:rPr>
           <w:rFonts w:ascii="Times New Roman" w:hAnsi="Times New Roman"/>
           <w:b w:val="0"/>
-          <w:i w:val="0"/>
-          <w:sz w:val="24"/>
-        </w:rPr>
-        <w:t>Figure 5.3: Receiver Operating Characteristic (ROC) Curves for Candidate ML Classifiers ......... 34</w:t>
+          <w:sz w:val="22"/>
+        </w:rPr>
+        <w:t>Figure 5.3: Receiver Operating Characteristic (ROC) Curves for Candidate ML Classifiers</w:t>
+      </w:r>
+      <w:r>
+        <w:rPr>
+          <w:rFonts w:ascii="Times New Roman" w:hAnsi="Times New Roman"/>
+          <w:b w:val="0"/>
+          <w:sz w:val="22"/>
+        </w:rPr>
+        <w:tab/>
+        <w:t>34</w:t>
       </w:r>
     </w:p>
     <w:p>
       <w:pPr>
-        <w:spacing w:line="360" w:lineRule="auto" w:after="120"/>
+        <w:tabs>
+          <w:tab w:pos="9360" w:val="right" w:leader="dot"/>
+        </w:tabs>
+        <w:spacing w:line="312" w:lineRule="auto" w:after="80"/>
         <w:jc w:val="left"/>
       </w:pPr>
       <w:r>
         <w:rPr>
           <w:rFonts w:ascii="Times New Roman" w:hAnsi="Times New Roman"/>
           <w:b w:val="0"/>
-          <w:i w:val="0"/>
-          <w:sz w:val="24"/>
-        </w:rPr>
-        <w:t>Figure 5.4: Per-Packet Latency vs. Classification Accuracy Trade-Off Across Configurations ....... 35</w:t>
+          <w:sz w:val="22"/>
+        </w:rPr>
+        <w:t>Figure 5.4: Per-Packet Latency vs. Classification Accuracy Trade-Off Across Configurations</w:t>
+      </w:r>
+      <w:r>
+        <w:rPr>
+          <w:rFonts w:ascii="Times New Roman" w:hAnsi="Times New Roman"/>
+          <w:b w:val="0"/>
+          <w:sz w:val="22"/>
+        </w:rPr>
+        <w:tab/>
+        <w:t>35</w:t>
       </w:r>
     </w:p>
     <w:p>
       <w:pPr>
-        <w:spacing w:line="360" w:lineRule="auto" w:after="120"/>
+        <w:tabs>
+          <w:tab w:pos="9360" w:val="right" w:leader="dot"/>
+        </w:tabs>
+        <w:spacing w:line="312" w:lineRule="auto" w:after="80"/>
         <w:jc w:val="left"/>
       </w:pPr>
       <w:r>
         <w:rPr>
           <w:rFonts w:ascii="Times New Roman" w:hAnsi="Times New Roman"/>
           <w:b w:val="0"/>
-          <w:i w:val="0"/>
-          <w:sz w:val="24"/>
-        </w:rPr>
-        <w:t>Figure 5.5: System Resource Utilization (CPU Load % and Memory Footprint MB) ....................... 36</w:t>
+          <w:sz w:val="22"/>
+        </w:rPr>
+        <w:t>Figure 5.5: System Resource Utilization (CPU Load % and Memory Footprint MB)</w:t>
+      </w:r>
+      <w:r>
+        <w:rPr>
+          <w:rFonts w:ascii="Times New Roman" w:hAnsi="Times New Roman"/>
+          <w:b w:val="0"/>
+          <w:sz w:val="22"/>
+        </w:rPr>
+        <w:tab/>
+        <w:t>36</w:t>
       </w:r>
     </w:p>
     <w:p>
       <w:pPr>
-        <w:spacing w:line="360" w:lineRule="auto" w:after="120"/>
+        <w:tabs>
+          <w:tab w:pos="9360" w:val="right" w:leader="dot"/>
+        </w:tabs>
+        <w:spacing w:line="312" w:lineRule="auto" w:after="80"/>
         <w:jc w:val="left"/>
       </w:pPr>
       <w:r>
         <w:rPr>
           <w:rFonts w:ascii="Times New Roman" w:hAnsi="Times New Roman"/>
           <w:b w:val="0"/>
-          <w:i w:val="0"/>
-          <w:sz w:val="24"/>
-        </w:rPr>
-        <w:t>Figure 5.6: Per-Packet Processing Latency Benchmark Comparison (ms/packet) ............................ 37</w:t>
+          <w:sz w:val="22"/>
+        </w:rPr>
+        <w:t>Figure 5.6: Per-Packet Processing Latency Benchmark Comparison (ms/packet)</w:t>
+      </w:r>
+      <w:r>
+        <w:rPr>
+          <w:rFonts w:ascii="Times New Roman" w:hAnsi="Times New Roman"/>
+          <w:b w:val="0"/>
+          <w:sz w:val="22"/>
+        </w:rPr>
+        <w:tab/>
+        <w:t>37</w:t>
       </w:r>
     </w:p>
     <w:p>
       <w:pPr>
-        <w:spacing w:line="360" w:lineRule="auto" w:after="120"/>
+        <w:tabs>
+          <w:tab w:pos="9360" w:val="right" w:leader="dot"/>
+        </w:tabs>
+        <w:spacing w:line="312" w:lineRule="auto" w:after="80"/>
         <w:jc w:val="left"/>
       </w:pPr>
       <w:r>
         <w:rPr>
           <w:rFonts w:ascii="Times New Roman" w:hAnsi="Times New Roman"/>
           <w:b w:val="0"/>
-          <w:i w:val="0"/>
-          <w:sz w:val="24"/>
-        </w:rPr>
-        <w:t>Figure 5.7: 3-Stage Feature Selection Pipeline Information Gain Ranking Chart ........................... 37</w:t>
+          <w:sz w:val="22"/>
+        </w:rPr>
+        <w:t>Figure 5.7: 3-Stage Feature Selection Pipeline Information Gain Ranking Chart</w:t>
+      </w:r>
+      <w:r>
+        <w:rPr>
+          <w:rFonts w:ascii="Times New Roman" w:hAnsi="Times New Roman"/>
+          <w:b w:val="0"/>
+          <w:sz w:val="22"/>
+        </w:rPr>
+        <w:tab/>
+        <w:t>37</w:t>
+      </w:r>
+    </w:p>
+    <w:p>
+      <w:r>
+        <w:br w:type="page"/>
       </w:r>
     </w:p>
     <w:p>
@@ -943,122 +2413,215 @@
     </w:p>
     <w:p>
       <w:pPr>
-        <w:spacing w:line="360" w:lineRule="auto" w:after="120"/>
+        <w:tabs>
+          <w:tab w:pos="9360" w:val="right" w:leader="dot"/>
+        </w:tabs>
+        <w:spacing w:line="312" w:lineRule="auto" w:after="80"/>
         <w:jc w:val="left"/>
       </w:pPr>
       <w:r>
         <w:rPr>
           <w:rFonts w:ascii="Times New Roman" w:hAnsi="Times New Roman"/>
           <w:b w:val="0"/>
-          <w:i w:val="0"/>
-          <w:sz w:val="24"/>
-        </w:rPr>
-        <w:t>Table 2.1: Architectural Comparison of Signature, Anomaly, and Hybrid IDS Frameworks ......... 12</w:t>
+          <w:sz w:val="22"/>
+        </w:rPr>
+        <w:t>Table 2.1: Architectural Comparison of Signature, Anomaly, and Hybrid IDS Frameworks</w:t>
+      </w:r>
+      <w:r>
+        <w:rPr>
+          <w:rFonts w:ascii="Times New Roman" w:hAnsi="Times New Roman"/>
+          <w:b w:val="0"/>
+          <w:sz w:val="22"/>
+        </w:rPr>
+        <w:tab/>
+        <w:t>13</w:t>
       </w:r>
     </w:p>
     <w:p>
       <w:pPr>
-        <w:spacing w:line="360" w:lineRule="auto" w:after="120"/>
+        <w:tabs>
+          <w:tab w:pos="9360" w:val="right" w:leader="dot"/>
+        </w:tabs>
+        <w:spacing w:line="312" w:lineRule="auto" w:after="80"/>
         <w:jc w:val="left"/>
       </w:pPr>
       <w:r>
         <w:rPr>
           <w:rFonts w:ascii="Times New Roman" w:hAnsi="Times New Roman"/>
           <w:b w:val="0"/>
-          <w:i w:val="0"/>
-          <w:sz w:val="24"/>
-        </w:rPr>
-        <w:t>Table 3.1: Phase 1 Signature Engine Deterministic Rules Logic &amp; Target Attack Mapping .......... 20</w:t>
+          <w:sz w:val="22"/>
+        </w:rPr>
+        <w:t>Table 3.1: Phase 1 Signature Engine Deterministic Rules Logic &amp; Target Attack Mapping</w:t>
+      </w:r>
+      <w:r>
+        <w:rPr>
+          <w:rFonts w:ascii="Times New Roman" w:hAnsi="Times New Roman"/>
+          <w:b w:val="0"/>
+          <w:sz w:val="22"/>
+        </w:rPr>
+        <w:tab/>
+        <w:t>18</w:t>
       </w:r>
     </w:p>
     <w:p>
       <w:pPr>
-        <w:spacing w:line="360" w:lineRule="auto" w:after="120"/>
+        <w:tabs>
+          <w:tab w:pos="9360" w:val="right" w:leader="dot"/>
+        </w:tabs>
+        <w:spacing w:line="312" w:lineRule="auto" w:after="80"/>
         <w:jc w:val="left"/>
       </w:pPr>
       <w:r>
         <w:rPr>
           <w:rFonts w:ascii="Times New Roman" w:hAnsi="Times New Roman"/>
           <w:b w:val="0"/>
-          <w:i w:val="0"/>
-          <w:sz w:val="24"/>
-        </w:rPr>
-        <w:t>Table 4.1: BoT-IoT Dataset Attributes, Definitions, and Data Type Specifications ......................... 26</w:t>
+          <w:sz w:val="22"/>
+        </w:rPr>
+        <w:t>Table 4.1: BoT-IoT Dataset Attributes, Definitions, and Data Type Specifications</w:t>
+      </w:r>
+      <w:r>
+        <w:rPr>
+          <w:rFonts w:ascii="Times New Roman" w:hAnsi="Times New Roman"/>
+          <w:b w:val="0"/>
+          <w:sz w:val="22"/>
+        </w:rPr>
+        <w:tab/>
+        <w:t>25</w:t>
       </w:r>
     </w:p>
     <w:p>
       <w:pPr>
-        <w:spacing w:line="360" w:lineRule="auto" w:after="120"/>
+        <w:tabs>
+          <w:tab w:pos="9360" w:val="right" w:leader="dot"/>
+        </w:tabs>
+        <w:spacing w:line="312" w:lineRule="auto" w:after="80"/>
         <w:jc w:val="left"/>
       </w:pPr>
       <w:r>
         <w:rPr>
           <w:rFonts w:ascii="Times New Roman" w:hAnsi="Times New Roman"/>
           <w:b w:val="0"/>
-          <w:i w:val="0"/>
-          <w:sz w:val="24"/>
-        </w:rPr>
-        <w:t>Table 5.1: 3-Stage Feature Selection Ranking and Selection Results across 12 Attributes .............. 31</w:t>
+          <w:sz w:val="22"/>
+        </w:rPr>
+        <w:t>Table 5.1: 3-Stage Feature Selection Ranking and Selection Results across 12 Attributes</w:t>
+      </w:r>
+      <w:r>
+        <w:rPr>
+          <w:rFonts w:ascii="Times New Roman" w:hAnsi="Times New Roman"/>
+          <w:b w:val="0"/>
+          <w:sz w:val="22"/>
+        </w:rPr>
+        <w:tab/>
+        <w:t>31</w:t>
       </w:r>
     </w:p>
     <w:p>
       <w:pPr>
-        <w:spacing w:line="360" w:lineRule="auto" w:after="120"/>
+        <w:tabs>
+          <w:tab w:pos="9360" w:val="right" w:leader="dot"/>
+        </w:tabs>
+        <w:spacing w:line="312" w:lineRule="auto" w:after="80"/>
         <w:jc w:val="left"/>
       </w:pPr>
       <w:r>
         <w:rPr>
           <w:rFonts w:ascii="Times New Roman" w:hAnsi="Times New Roman"/>
           <w:b w:val="0"/>
-          <w:i w:val="0"/>
-          <w:sz w:val="24"/>
-        </w:rPr>
-        <w:t>Table 5.2: Machine Learning Classifiers Benchmark Performance Comparison ............................ 33</w:t>
+          <w:sz w:val="22"/>
+        </w:rPr>
+        <w:t>Table 5.2: Machine Learning Classifiers Benchmark Performance Comparison</w:t>
+      </w:r>
+      <w:r>
+        <w:rPr>
+          <w:rFonts w:ascii="Times New Roman" w:hAnsi="Times New Roman"/>
+          <w:b w:val="0"/>
+          <w:sz w:val="22"/>
+        </w:rPr>
+        <w:tab/>
+        <w:t>32</w:t>
       </w:r>
     </w:p>
     <w:p>
       <w:pPr>
-        <w:spacing w:line="360" w:lineRule="auto" w:after="120"/>
+        <w:tabs>
+          <w:tab w:pos="9360" w:val="right" w:leader="dot"/>
+        </w:tabs>
+        <w:spacing w:line="312" w:lineRule="auto" w:after="80"/>
         <w:jc w:val="left"/>
       </w:pPr>
       <w:r>
         <w:rPr>
           <w:rFonts w:ascii="Times New Roman" w:hAnsi="Times New Roman"/>
           <w:b w:val="0"/>
-          <w:i w:val="0"/>
-          <w:sz w:val="24"/>
-        </w:rPr>
-        <w:t>Table 5.3: Comparative Performance of Standalone Signature, ML, and Proposed Hybrid IDS ...... 34</w:t>
+          <w:sz w:val="22"/>
+        </w:rPr>
+        <w:t>Table 5.3: Comparative Performance of Standalone Signature, ML, and Proposed Hybrid IDS</w:t>
+      </w:r>
+      <w:r>
+        <w:rPr>
+          <w:rFonts w:ascii="Times New Roman" w:hAnsi="Times New Roman"/>
+          <w:b w:val="0"/>
+          <w:sz w:val="22"/>
+        </w:rPr>
+        <w:tab/>
+        <w:t>33</w:t>
       </w:r>
     </w:p>
     <w:p>
       <w:pPr>
-        <w:spacing w:line="360" w:lineRule="auto" w:after="120"/>
+        <w:tabs>
+          <w:tab w:pos="9360" w:val="right" w:leader="dot"/>
+        </w:tabs>
+        <w:spacing w:line="312" w:lineRule="auto" w:after="80"/>
         <w:jc w:val="left"/>
       </w:pPr>
       <w:r>
         <w:rPr>
           <w:rFonts w:ascii="Times New Roman" w:hAnsi="Times New Roman"/>
           <w:b w:val="0"/>
-          <w:i w:val="0"/>
-          <w:sz w:val="24"/>
-        </w:rPr>
-        <w:t>Table 5.4: Hardware Resource Consumption (CPU Load % &amp; RAM Footprint MB) ........................ 36</w:t>
+          <w:sz w:val="22"/>
+        </w:rPr>
+        <w:t>Table 5.4: Hardware Resource Consumption (CPU Load % &amp; RAM Footprint MB)</w:t>
+      </w:r>
+      <w:r>
+        <w:rPr>
+          <w:rFonts w:ascii="Times New Roman" w:hAnsi="Times New Roman"/>
+          <w:b w:val="0"/>
+          <w:sz w:val="22"/>
+        </w:rPr>
+        <w:tab/>
+        <w:t>35</w:t>
       </w:r>
     </w:p>
     <w:p>
       <w:pPr>
-        <w:spacing w:line="360" w:lineRule="auto" w:after="120"/>
+        <w:tabs>
+          <w:tab w:pos="9360" w:val="right" w:leader="dot"/>
+        </w:tabs>
+        <w:spacing w:line="312" w:lineRule="auto" w:after="80"/>
         <w:jc w:val="left"/>
       </w:pPr>
       <w:r>
         <w:rPr>
           <w:rFonts w:ascii="Times New Roman" w:hAnsi="Times New Roman"/>
           <w:b w:val="0"/>
-          <w:i w:val="0"/>
-          <w:sz w:val="24"/>
-        </w:rPr>
-        <w:t>Table 5.5: Zero-Day Attack Simulation Detection Rate &amp; Fallback Recall Breakdown .................. 37</w:t>
+          <w:sz w:val="22"/>
+        </w:rPr>
+        <w:t>Table 5.5: Zero-Day Attack Simulation Detection Rate &amp; Fallback Recall Breakdown</w:t>
+      </w:r>
+      <w:r>
+        <w:rPr>
+          <w:rFonts w:ascii="Times New Roman" w:hAnsi="Times New Roman"/>
+          <w:b w:val="0"/>
+          <w:sz w:val="22"/>
+        </w:rPr>
+        <w:tab/>
+        <w:t>36</w:t>
+      </w:r>
+    </w:p>
+    <w:p>
+      <w:r>
+        <w:br w:type="page"/>
       </w:r>
     </w:p>
     <w:p>
@@ -2739,7 +4302,7 @@
     <w:p>
       <w:pPr>
         <w:spacing w:line="360" w:lineRule="auto" w:after="120"/>
-        <w:jc w:val="left"/>
+        <w:jc w:val="both"/>
       </w:pPr>
       <w:r>
         <w:rPr>
@@ -2754,7 +4317,7 @@
     <w:p>
       <w:pPr>
         <w:spacing w:line="360" w:lineRule="auto" w:after="120"/>
-        <w:jc w:val="left"/>
+        <w:jc w:val="both"/>
       </w:pPr>
       <w:r>
         <w:rPr>
@@ -2769,7 +4332,7 @@
     <w:p>
       <w:pPr>
         <w:spacing w:line="360" w:lineRule="auto" w:after="120"/>
-        <w:jc w:val="left"/>
+        <w:jc w:val="both"/>
       </w:pPr>
       <w:r>
         <w:rPr>
@@ -2784,7 +4347,7 @@
     <w:p>
       <w:pPr>
         <w:spacing w:line="360" w:lineRule="auto" w:after="120"/>
-        <w:jc w:val="left"/>
+        <w:jc w:val="both"/>
       </w:pPr>
       <w:r>
         <w:rPr>
@@ -2799,7 +4362,7 @@
     <w:p>
       <w:pPr>
         <w:spacing w:line="360" w:lineRule="auto" w:after="120"/>
-        <w:jc w:val="left"/>
+        <w:jc w:val="both"/>
       </w:pPr>
       <w:r>
         <w:rPr>
@@ -2814,7 +4377,7 @@
     <w:p>
       <w:pPr>
         <w:spacing w:line="360" w:lineRule="auto" w:after="120"/>
-        <w:jc w:val="left"/>
+        <w:jc w:val="both"/>
       </w:pPr>
       <w:r>
         <w:rPr>
@@ -2844,7 +4407,7 @@
     <w:p>
       <w:pPr>
         <w:spacing w:line="360" w:lineRule="auto" w:after="120"/>
-        <w:jc w:val="left"/>
+        <w:jc w:val="both"/>
       </w:pPr>
       <w:r>
         <w:rPr>
@@ -2860,6 +4423,7 @@
       <w:pPr>
         <w:pStyle w:val="ListBullet"/>
         <w:spacing w:line="360" w:lineRule="auto" w:after="80"/>
+        <w:jc w:val="both"/>
       </w:pPr>
       <w:r>
         <w:rPr>
@@ -2881,6 +4445,7 @@
       <w:pPr>
         <w:pStyle w:val="ListBullet"/>
         <w:spacing w:line="360" w:lineRule="auto" w:after="80"/>
+        <w:jc w:val="both"/>
       </w:pPr>
       <w:r>
         <w:rPr>
@@ -2902,6 +4467,7 @@
       <w:pPr>
         <w:pStyle w:val="ListBullet"/>
         <w:spacing w:line="360" w:lineRule="auto" w:after="80"/>
+        <w:jc w:val="both"/>
       </w:pPr>
       <w:r>
         <w:rPr>
@@ -2937,7 +4503,7 @@
     <w:p>
       <w:pPr>
         <w:spacing w:line="360" w:lineRule="auto" w:after="120"/>
-        <w:jc w:val="left"/>
+        <w:jc w:val="both"/>
       </w:pPr>
       <w:r>
         <w:rPr>
@@ -2952,7 +4518,7 @@
     <w:p>
       <w:pPr>
         <w:spacing w:line="360" w:lineRule="auto" w:after="120"/>
-        <w:jc w:val="left"/>
+        <w:jc w:val="both"/>
       </w:pPr>
       <w:r>
         <w:rPr>
@@ -2968,6 +4534,7 @@
       <w:pPr>
         <w:pStyle w:val="ListBullet"/>
         <w:spacing w:line="360" w:lineRule="auto" w:after="80"/>
+        <w:jc w:val="both"/>
       </w:pPr>
       <w:r>
         <w:rPr>
@@ -2989,6 +4556,7 @@
       <w:pPr>
         <w:pStyle w:val="ListBullet"/>
         <w:spacing w:line="360" w:lineRule="auto" w:after="80"/>
+        <w:jc w:val="both"/>
       </w:pPr>
       <w:r>
         <w:rPr>
@@ -3010,6 +4578,7 @@
       <w:pPr>
         <w:pStyle w:val="ListBullet"/>
         <w:spacing w:line="360" w:lineRule="auto" w:after="80"/>
+        <w:jc w:val="both"/>
       </w:pPr>
       <w:r>
         <w:rPr>
@@ -3031,6 +4600,7 @@
       <w:pPr>
         <w:pStyle w:val="ListBullet"/>
         <w:spacing w:line="360" w:lineRule="auto" w:after="80"/>
+        <w:jc w:val="both"/>
       </w:pPr>
       <w:r>
         <w:rPr>
@@ -3052,6 +4622,7 @@
       <w:pPr>
         <w:pStyle w:val="ListBullet"/>
         <w:spacing w:line="360" w:lineRule="auto" w:after="80"/>
+        <w:jc w:val="both"/>
       </w:pPr>
       <w:r>
         <w:rPr>
@@ -3073,6 +4644,7 @@
       <w:pPr>
         <w:pStyle w:val="ListBullet"/>
         <w:spacing w:line="360" w:lineRule="auto" w:after="80"/>
+        <w:jc w:val="both"/>
       </w:pPr>
       <w:r>
         <w:rPr>
@@ -3094,6 +4666,7 @@
       <w:pPr>
         <w:pStyle w:val="ListBullet"/>
         <w:spacing w:line="360" w:lineRule="auto" w:after="80"/>
+        <w:jc w:val="both"/>
       </w:pPr>
       <w:r>
         <w:rPr>
@@ -3115,6 +4688,7 @@
       <w:pPr>
         <w:pStyle w:val="ListBullet"/>
         <w:spacing w:line="360" w:lineRule="auto" w:after="80"/>
+        <w:jc w:val="both"/>
       </w:pPr>
       <w:r>
         <w:rPr>
@@ -3150,7 +4724,7 @@
     <w:p>
       <w:pPr>
         <w:spacing w:line="360" w:lineRule="auto" w:after="120"/>
-        <w:jc w:val="left"/>
+        <w:jc w:val="both"/>
       </w:pPr>
       <w:r>
         <w:rPr>
@@ -3166,6 +4740,7 @@
       <w:pPr>
         <w:pStyle w:val="ListBullet"/>
         <w:spacing w:line="360" w:lineRule="auto" w:after="80"/>
+        <w:jc w:val="both"/>
       </w:pPr>
       <w:r>
         <w:rPr>
@@ -3187,6 +4762,7 @@
       <w:pPr>
         <w:pStyle w:val="ListBullet"/>
         <w:spacing w:line="360" w:lineRule="auto" w:after="80"/>
+        <w:jc w:val="both"/>
       </w:pPr>
       <w:r>
         <w:rPr>
@@ -3208,6 +4784,7 @@
       <w:pPr>
         <w:pStyle w:val="ListBullet"/>
         <w:spacing w:line="360" w:lineRule="auto" w:after="80"/>
+        <w:jc w:val="both"/>
       </w:pPr>
       <w:r>
         <w:rPr>
@@ -3229,6 +4806,7 @@
       <w:pPr>
         <w:pStyle w:val="ListBullet"/>
         <w:spacing w:line="360" w:lineRule="auto" w:after="80"/>
+        <w:jc w:val="both"/>
       </w:pPr>
       <w:r>
         <w:rPr>
@@ -3250,6 +4828,7 @@
       <w:pPr>
         <w:pStyle w:val="ListBullet"/>
         <w:spacing w:line="360" w:lineRule="auto" w:after="80"/>
+        <w:jc w:val="both"/>
       </w:pPr>
       <w:r>
         <w:rPr>
@@ -3285,7 +4864,7 @@
     <w:p>
       <w:pPr>
         <w:spacing w:line="360" w:lineRule="auto" w:after="120"/>
-        <w:jc w:val="left"/>
+        <w:jc w:val="both"/>
       </w:pPr>
       <w:r>
         <w:rPr>
@@ -3300,7 +4879,7 @@
     <w:p>
       <w:pPr>
         <w:spacing w:line="360" w:lineRule="auto" w:after="120"/>
-        <w:jc w:val="left"/>
+        <w:jc w:val="both"/>
       </w:pPr>
       <w:r>
         <w:rPr>
@@ -3316,6 +4895,7 @@
       <w:pPr>
         <w:pStyle w:val="ListBullet"/>
         <w:spacing w:line="360" w:lineRule="auto" w:after="80"/>
+        <w:jc w:val="both"/>
       </w:pPr>
       <w:r>
         <w:rPr>
@@ -3337,6 +4917,7 @@
       <w:pPr>
         <w:pStyle w:val="ListBullet"/>
         <w:spacing w:line="360" w:lineRule="auto" w:after="80"/>
+        <w:jc w:val="both"/>
       </w:pPr>
       <w:r>
         <w:rPr>
@@ -3358,6 +4939,7 @@
       <w:pPr>
         <w:pStyle w:val="ListBullet"/>
         <w:spacing w:line="360" w:lineRule="auto" w:after="80"/>
+        <w:jc w:val="both"/>
       </w:pPr>
       <w:r>
         <w:rPr>
@@ -3379,6 +4961,7 @@
       <w:pPr>
         <w:pStyle w:val="ListBullet"/>
         <w:spacing w:line="360" w:lineRule="auto" w:after="80"/>
+        <w:jc w:val="both"/>
       </w:pPr>
       <w:r>
         <w:rPr>
@@ -3400,6 +4983,7 @@
       <w:pPr>
         <w:pStyle w:val="ListBullet"/>
         <w:spacing w:line="360" w:lineRule="auto" w:after="80"/>
+        <w:jc w:val="both"/>
       </w:pPr>
       <w:r>
         <w:rPr>
@@ -3435,7 +5019,7 @@
     <w:p>
       <w:pPr>
         <w:spacing w:line="360" w:lineRule="auto" w:after="120"/>
-        <w:jc w:val="left"/>
+        <w:jc w:val="both"/>
       </w:pPr>
       <w:r>
         <w:rPr>
@@ -3451,6 +5035,7 @@
       <w:pPr>
         <w:pStyle w:val="ListBullet"/>
         <w:spacing w:line="360" w:lineRule="auto" w:after="80"/>
+        <w:jc w:val="both"/>
       </w:pPr>
       <w:r>
         <w:rPr>
@@ -3472,6 +5057,7 @@
       <w:pPr>
         <w:pStyle w:val="ListBullet"/>
         <w:spacing w:line="360" w:lineRule="auto" w:after="80"/>
+        <w:jc w:val="both"/>
       </w:pPr>
       <w:r>
         <w:rPr>
@@ -3493,6 +5079,7 @@
       <w:pPr>
         <w:pStyle w:val="ListBullet"/>
         <w:spacing w:line="360" w:lineRule="auto" w:after="80"/>
+        <w:jc w:val="both"/>
       </w:pPr>
       <w:r>
         <w:rPr>
@@ -3514,6 +5101,7 @@
       <w:pPr>
         <w:pStyle w:val="ListBullet"/>
         <w:spacing w:line="360" w:lineRule="auto" w:after="80"/>
+        <w:jc w:val="both"/>
       </w:pPr>
       <w:r>
         <w:rPr>
@@ -3535,6 +5123,7 @@
       <w:pPr>
         <w:pStyle w:val="ListBullet"/>
         <w:spacing w:line="360" w:lineRule="auto" w:after="80"/>
+        <w:jc w:val="both"/>
       </w:pPr>
       <w:r>
         <w:rPr>
@@ -3556,6 +5145,7 @@
       <w:pPr>
         <w:pStyle w:val="ListBullet"/>
         <w:spacing w:line="360" w:lineRule="auto" w:after="80"/>
+        <w:jc w:val="both"/>
       </w:pPr>
       <w:r>
         <w:rPr>
@@ -3611,7 +5201,7 @@
     <w:p>
       <w:pPr>
         <w:spacing w:line="360" w:lineRule="auto" w:after="120"/>
-        <w:jc w:val="left"/>
+        <w:jc w:val="both"/>
       </w:pPr>
       <w:r>
         <w:rPr>
@@ -3626,7 +5216,7 @@
     <w:p>
       <w:pPr>
         <w:spacing w:line="360" w:lineRule="auto" w:after="120"/>
-        <w:jc w:val="left"/>
+        <w:jc w:val="both"/>
       </w:pPr>
       <w:r>
         <w:rPr>
@@ -3642,6 +5232,7 @@
       <w:pPr>
         <w:pStyle w:val="ListBullet"/>
         <w:spacing w:line="360" w:lineRule="auto" w:after="80"/>
+        <w:jc w:val="both"/>
       </w:pPr>
       <w:r>
         <w:rPr>
@@ -3663,6 +5254,7 @@
       <w:pPr>
         <w:pStyle w:val="ListBullet"/>
         <w:spacing w:line="360" w:lineRule="auto" w:after="80"/>
+        <w:jc w:val="both"/>
       </w:pPr>
       <w:r>
         <w:rPr>
@@ -3684,6 +5276,7 @@
       <w:pPr>
         <w:pStyle w:val="ListBullet"/>
         <w:spacing w:line="360" w:lineRule="auto" w:after="80"/>
+        <w:jc w:val="both"/>
       </w:pPr>
       <w:r>
         <w:rPr>
@@ -3705,6 +5298,7 @@
       <w:pPr>
         <w:pStyle w:val="ListBullet"/>
         <w:spacing w:line="360" w:lineRule="auto" w:after="80"/>
+        <w:jc w:val="both"/>
       </w:pPr>
       <w:r>
         <w:rPr>
@@ -3725,7 +5319,7 @@
     <w:p>
       <w:pPr>
         <w:spacing w:line="360" w:lineRule="auto" w:after="120"/>
-        <w:jc w:val="left"/>
+        <w:jc w:val="both"/>
       </w:pPr>
       <w:r>
         <w:rPr>
@@ -3755,7 +5349,7 @@
     <w:p>
       <w:pPr>
         <w:spacing w:line="360" w:lineRule="auto" w:after="120"/>
-        <w:jc w:val="left"/>
+        <w:jc w:val="both"/>
       </w:pPr>
       <w:r>
         <w:rPr>
@@ -3770,7 +5364,7 @@
     <w:p>
       <w:pPr>
         <w:spacing w:line="360" w:lineRule="auto" w:after="120"/>
-        <w:jc w:val="left"/>
+        <w:jc w:val="both"/>
       </w:pPr>
       <w:r>
         <w:rPr>
@@ -3800,7 +5394,7 @@
     <w:p>
       <w:pPr>
         <w:spacing w:line="360" w:lineRule="auto" w:after="120"/>
-        <w:jc w:val="left"/>
+        <w:jc w:val="both"/>
       </w:pPr>
       <w:r>
         <w:rPr>
@@ -3815,7 +5409,7 @@
     <w:p>
       <w:pPr>
         <w:spacing w:line="360" w:lineRule="auto" w:after="120"/>
-        <w:jc w:val="left"/>
+        <w:jc w:val="both"/>
       </w:pPr>
       <w:r>
         <w:rPr>
@@ -3830,7 +5424,7 @@
     <w:p>
       <w:pPr>
         <w:spacing w:line="360" w:lineRule="auto" w:after="120"/>
-        <w:jc w:val="left"/>
+        <w:jc w:val="both"/>
       </w:pPr>
       <w:r>
         <w:rPr>
@@ -3860,7 +5454,7 @@
     <w:p>
       <w:pPr>
         <w:spacing w:line="360" w:lineRule="auto" w:after="120"/>
-        <w:jc w:val="left"/>
+        <w:jc w:val="both"/>
       </w:pPr>
       <w:r>
         <w:rPr>
@@ -3875,7 +5469,7 @@
     <w:p>
       <w:pPr>
         <w:spacing w:line="360" w:lineRule="auto" w:after="120"/>
-        <w:jc w:val="left"/>
+        <w:jc w:val="both"/>
       </w:pPr>
       <w:r>
         <w:rPr>
@@ -3890,7 +5484,7 @@
     <w:p>
       <w:pPr>
         <w:spacing w:line="360" w:lineRule="auto" w:after="120"/>
-        <w:jc w:val="left"/>
+        <w:jc w:val="both"/>
       </w:pPr>
       <w:r>
         <w:rPr>
@@ -3920,7 +5514,7 @@
     <w:p>
       <w:pPr>
         <w:spacing w:line="360" w:lineRule="auto" w:after="120"/>
-        <w:jc w:val="left"/>
+        <w:jc w:val="both"/>
       </w:pPr>
       <w:r>
         <w:rPr>
@@ -3936,6 +5530,7 @@
       <w:pPr>
         <w:pStyle w:val="ListBullet"/>
         <w:spacing w:line="360" w:lineRule="auto" w:after="80"/>
+        <w:jc w:val="both"/>
       </w:pPr>
       <w:r>
         <w:rPr>
@@ -3957,6 +5552,7 @@
       <w:pPr>
         <w:pStyle w:val="ListBullet"/>
         <w:spacing w:line="360" w:lineRule="auto" w:after="80"/>
+        <w:jc w:val="both"/>
       </w:pPr>
       <w:r>
         <w:rPr>
@@ -3978,6 +5574,7 @@
       <w:pPr>
         <w:pStyle w:val="ListBullet"/>
         <w:spacing w:line="360" w:lineRule="auto" w:after="80"/>
+        <w:jc w:val="both"/>
       </w:pPr>
       <w:r>
         <w:rPr>
@@ -4013,7 +5610,7 @@
     <w:p>
       <w:pPr>
         <w:spacing w:line="360" w:lineRule="auto" w:after="120"/>
-        <w:jc w:val="left"/>
+        <w:jc w:val="both"/>
       </w:pPr>
       <w:r>
         <w:rPr>
@@ -4687,7 +6284,7 @@
     <w:p>
       <w:pPr>
         <w:spacing w:line="360" w:lineRule="auto" w:after="120"/>
-        <w:jc w:val="left"/>
+        <w:jc w:val="both"/>
       </w:pPr>
       <w:r>
         <w:rPr>
@@ -4703,6 +6300,7 @@
       <w:pPr>
         <w:pStyle w:val="ListBullet"/>
         <w:spacing w:line="360" w:lineRule="auto" w:after="80"/>
+        <w:jc w:val="both"/>
       </w:pPr>
       <w:r>
         <w:rPr>
@@ -4724,6 +6322,7 @@
       <w:pPr>
         <w:pStyle w:val="ListBullet"/>
         <w:spacing w:line="360" w:lineRule="auto" w:after="80"/>
+        <w:jc w:val="both"/>
       </w:pPr>
       <w:r>
         <w:rPr>
@@ -4745,6 +6344,7 @@
       <w:pPr>
         <w:pStyle w:val="ListBullet"/>
         <w:spacing w:line="360" w:lineRule="auto" w:after="80"/>
+        <w:jc w:val="both"/>
       </w:pPr>
       <w:r>
         <w:rPr>
@@ -4765,7 +6365,7 @@
     <w:p>
       <w:pPr>
         <w:spacing w:line="360" w:lineRule="auto" w:after="120"/>
-        <w:jc w:val="left"/>
+        <w:jc w:val="both"/>
       </w:pPr>
       <w:r>
         <w:rPr>
@@ -4795,7 +6395,7 @@
     <w:p>
       <w:pPr>
         <w:spacing w:line="360" w:lineRule="auto" w:after="120"/>
-        <w:jc w:val="left"/>
+        <w:jc w:val="both"/>
       </w:pPr>
       <w:r>
         <w:rPr>
@@ -4810,7 +6410,7 @@
     <w:p>
       <w:pPr>
         <w:spacing w:line="360" w:lineRule="auto" w:after="120"/>
-        <w:jc w:val="left"/>
+        <w:jc w:val="both"/>
       </w:pPr>
       <w:r>
         <w:rPr>
@@ -4840,7 +6440,7 @@
     <w:p>
       <w:pPr>
         <w:spacing w:line="360" w:lineRule="auto" w:after="120"/>
-        <w:jc w:val="left"/>
+        <w:jc w:val="both"/>
       </w:pPr>
       <w:r>
         <w:rPr>
@@ -4870,7 +6470,7 @@
     <w:p>
       <w:pPr>
         <w:spacing w:line="360" w:lineRule="auto" w:after="120"/>
-        <w:jc w:val="left"/>
+        <w:jc w:val="both"/>
       </w:pPr>
       <w:r>
         <w:rPr>
@@ -4885,7 +6485,7 @@
     <w:p>
       <w:pPr>
         <w:spacing w:line="360" w:lineRule="auto" w:after="120"/>
-        <w:jc w:val="left"/>
+        <w:jc w:val="both"/>
       </w:pPr>
       <w:r>
         <w:rPr>
@@ -4915,7 +6515,7 @@
     <w:p>
       <w:pPr>
         <w:spacing w:line="360" w:lineRule="auto" w:after="120"/>
-        <w:jc w:val="left"/>
+        <w:jc w:val="both"/>
       </w:pPr>
       <w:r>
         <w:rPr>
@@ -4931,6 +6531,7 @@
       <w:pPr>
         <w:pStyle w:val="ListBullet"/>
         <w:spacing w:line="360" w:lineRule="auto" w:after="80"/>
+        <w:jc w:val="both"/>
       </w:pPr>
       <w:r>
         <w:rPr>
@@ -4952,6 +6553,7 @@
       <w:pPr>
         <w:pStyle w:val="ListBullet"/>
         <w:spacing w:line="360" w:lineRule="auto" w:after="80"/>
+        <w:jc w:val="both"/>
       </w:pPr>
       <w:r>
         <w:rPr>
@@ -4973,6 +6575,7 @@
       <w:pPr>
         <w:pStyle w:val="ListBullet"/>
         <w:spacing w:line="360" w:lineRule="auto" w:after="80"/>
+        <w:jc w:val="both"/>
       </w:pPr>
       <w:r>
         <w:rPr>
@@ -5028,7 +6631,7 @@
     <w:p>
       <w:pPr>
         <w:spacing w:line="360" w:lineRule="auto" w:after="120"/>
-        <w:jc w:val="left"/>
+        <w:jc w:val="both"/>
       </w:pPr>
       <w:r>
         <w:rPr>
@@ -5043,7 +6646,7 @@
     <w:p>
       <w:pPr>
         <w:spacing w:line="360" w:lineRule="auto" w:after="120"/>
-        <w:jc w:val="left"/>
+        <w:jc w:val="both"/>
       </w:pPr>
       <w:r>
         <w:rPr>
@@ -5073,7 +6676,7 @@
     <w:p>
       <w:pPr>
         <w:spacing w:line="360" w:lineRule="auto" w:after="120"/>
-        <w:jc w:val="left"/>
+        <w:jc w:val="both"/>
       </w:pPr>
       <w:r>
         <w:rPr>
@@ -5103,7 +6706,7 @@
     <w:p>
       <w:pPr>
         <w:spacing w:line="360" w:lineRule="auto" w:after="120"/>
-        <w:jc w:val="left"/>
+        <w:jc w:val="both"/>
       </w:pPr>
       <w:r>
         <w:rPr>
@@ -5118,7 +6721,7 @@
     <w:p>
       <w:pPr>
         <w:spacing w:line="360" w:lineRule="auto" w:after="120"/>
-        <w:jc w:val="left"/>
+        <w:jc w:val="both"/>
       </w:pPr>
       <w:r>
         <w:rPr>
@@ -5148,7 +6751,7 @@
     <w:p>
       <w:pPr>
         <w:spacing w:line="360" w:lineRule="auto" w:after="120"/>
-        <w:jc w:val="left"/>
+        <w:jc w:val="both"/>
       </w:pPr>
       <w:r>
         <w:rPr>
@@ -6230,7 +7833,7 @@
     <w:p>
       <w:pPr>
         <w:spacing w:line="360" w:lineRule="auto" w:after="120"/>
-        <w:jc w:val="left"/>
+        <w:jc w:val="both"/>
       </w:pPr>
       <w:r>
         <w:rPr>
@@ -6260,7 +7863,7 @@
     <w:p>
       <w:pPr>
         <w:spacing w:line="360" w:lineRule="auto" w:after="120"/>
-        <w:jc w:val="left"/>
+        <w:jc w:val="both"/>
       </w:pPr>
       <w:r>
         <w:rPr>
@@ -6276,6 +7879,7 @@
       <w:pPr>
         <w:pStyle w:val="ListBullet"/>
         <w:spacing w:line="360" w:lineRule="auto" w:after="80"/>
+        <w:jc w:val="both"/>
       </w:pPr>
       <w:r>
         <w:rPr>
@@ -6297,6 +7901,7 @@
       <w:pPr>
         <w:pStyle w:val="ListBullet"/>
         <w:spacing w:line="360" w:lineRule="auto" w:after="80"/>
+        <w:jc w:val="both"/>
       </w:pPr>
       <w:r>
         <w:rPr>
@@ -6318,6 +7923,7 @@
       <w:pPr>
         <w:pStyle w:val="ListBullet"/>
         <w:spacing w:line="360" w:lineRule="auto" w:after="80"/>
+        <w:jc w:val="both"/>
       </w:pPr>
       <w:r>
         <w:rPr>
@@ -6353,7 +7959,7 @@
     <w:p>
       <w:pPr>
         <w:spacing w:line="360" w:lineRule="auto" w:after="120"/>
-        <w:jc w:val="left"/>
+        <w:jc w:val="both"/>
       </w:pPr>
       <w:r>
         <w:rPr>
@@ -6369,6 +7975,7 @@
       <w:pPr>
         <w:pStyle w:val="ListBullet"/>
         <w:spacing w:line="360" w:lineRule="auto" w:after="80"/>
+        <w:jc w:val="both"/>
       </w:pPr>
       <w:r>
         <w:rPr>
@@ -6390,6 +7997,7 @@
       <w:pPr>
         <w:pStyle w:val="ListBullet"/>
         <w:spacing w:line="360" w:lineRule="auto" w:after="80"/>
+        <w:jc w:val="both"/>
       </w:pPr>
       <w:r>
         <w:rPr>
@@ -6411,6 +8019,7 @@
       <w:pPr>
         <w:pStyle w:val="ListBullet"/>
         <w:spacing w:line="360" w:lineRule="auto" w:after="80"/>
+        <w:jc w:val="both"/>
       </w:pPr>
       <w:r>
         <w:rPr>
@@ -6432,6 +8041,7 @@
       <w:pPr>
         <w:pStyle w:val="ListBullet"/>
         <w:spacing w:line="360" w:lineRule="auto" w:after="80"/>
+        <w:jc w:val="both"/>
       </w:pPr>
       <w:r>
         <w:rPr>
@@ -6453,6 +8063,7 @@
       <w:pPr>
         <w:pStyle w:val="ListBullet"/>
         <w:spacing w:line="360" w:lineRule="auto" w:after="80"/>
+        <w:jc w:val="both"/>
       </w:pPr>
       <w:r>
         <w:rPr>
@@ -6474,6 +8085,7 @@
       <w:pPr>
         <w:pStyle w:val="ListBullet"/>
         <w:spacing w:line="360" w:lineRule="auto" w:after="80"/>
+        <w:jc w:val="both"/>
       </w:pPr>
       <w:r>
         <w:rPr>
@@ -6495,6 +8107,7 @@
       <w:pPr>
         <w:pStyle w:val="ListBullet"/>
         <w:spacing w:line="360" w:lineRule="auto" w:after="80"/>
+        <w:jc w:val="both"/>
       </w:pPr>
       <w:r>
         <w:rPr>
@@ -6530,7 +8143,7 @@
     <w:p>
       <w:pPr>
         <w:spacing w:line="360" w:lineRule="auto" w:after="120"/>
-        <w:jc w:val="left"/>
+        <w:jc w:val="both"/>
       </w:pPr>
       <w:r>
         <w:rPr>
@@ -6580,7 +8193,7 @@
     <w:p>
       <w:pPr>
         <w:spacing w:line="360" w:lineRule="auto" w:after="120"/>
-        <w:jc w:val="left"/>
+        <w:jc w:val="both"/>
       </w:pPr>
       <w:r>
         <w:rPr>
@@ -6610,7 +8223,7 @@
     <w:p>
       <w:pPr>
         <w:spacing w:line="360" w:lineRule="auto" w:after="120"/>
-        <w:jc w:val="left"/>
+        <w:jc w:val="both"/>
       </w:pPr>
       <w:r>
         <w:rPr>
@@ -7998,7 +9611,7 @@
     <w:p>
       <w:pPr>
         <w:spacing w:line="360" w:lineRule="auto" w:after="120"/>
-        <w:jc w:val="left"/>
+        <w:jc w:val="both"/>
       </w:pPr>
       <w:r>
         <w:rPr>
@@ -8043,7 +9656,7 @@
     <w:p>
       <w:pPr>
         <w:spacing w:line="360" w:lineRule="auto" w:after="120"/>
-        <w:jc w:val="left"/>
+        <w:jc w:val="both"/>
       </w:pPr>
       <w:r>
         <w:rPr>
@@ -8073,7 +9686,7 @@
     <w:p>
       <w:pPr>
         <w:spacing w:line="360" w:lineRule="auto" w:after="120"/>
-        <w:jc w:val="left"/>
+        <w:jc w:val="both"/>
       </w:pPr>
       <w:r>
         <w:rPr>
@@ -8103,7 +9716,7 @@
     <w:p>
       <w:pPr>
         <w:spacing w:line="360" w:lineRule="auto" w:after="120"/>
-        <w:jc w:val="left"/>
+        <w:jc w:val="both"/>
       </w:pPr>
       <w:r>
         <w:rPr>
@@ -8133,7 +9746,7 @@
     <w:p>
       <w:pPr>
         <w:spacing w:line="360" w:lineRule="auto" w:after="120"/>
-        <w:jc w:val="left"/>
+        <w:jc w:val="both"/>
       </w:pPr>
       <w:r>
         <w:rPr>
@@ -8163,7 +9776,7 @@
     <w:p>
       <w:pPr>
         <w:spacing w:line="360" w:lineRule="auto" w:after="120"/>
-        <w:jc w:val="left"/>
+        <w:jc w:val="both"/>
       </w:pPr>
       <w:r>
         <w:rPr>
@@ -8193,7 +9806,7 @@
     <w:p>
       <w:pPr>
         <w:spacing w:line="360" w:lineRule="auto" w:after="120"/>
-        <w:jc w:val="left"/>
+        <w:jc w:val="both"/>
       </w:pPr>
       <w:r>
         <w:rPr>
@@ -8243,7 +9856,7 @@
     <w:p>
       <w:pPr>
         <w:spacing w:line="360" w:lineRule="auto" w:after="120"/>
-        <w:jc w:val="left"/>
+        <w:jc w:val="both"/>
       </w:pPr>
       <w:r>
         <w:rPr>
@@ -9943,7 +11556,7 @@
     <w:p>
       <w:pPr>
         <w:spacing w:line="360" w:lineRule="auto" w:after="120"/>
-        <w:jc w:val="left"/>
+        <w:jc w:val="both"/>
       </w:pPr>
       <w:r>
         <w:rPr>
@@ -9973,7 +11586,7 @@
     <w:p>
       <w:pPr>
         <w:spacing w:line="360" w:lineRule="auto" w:after="120"/>
-        <w:jc w:val="left"/>
+        <w:jc w:val="both"/>
       </w:pPr>
       <w:r>
         <w:rPr>
@@ -10734,7 +12347,7 @@
     <w:p>
       <w:pPr>
         <w:spacing w:line="360" w:lineRule="auto" w:after="120"/>
-        <w:jc w:val="left"/>
+        <w:jc w:val="both"/>
       </w:pPr>
       <w:r>
         <w:rPr>
@@ -10764,7 +12377,7 @@
     <w:p>
       <w:pPr>
         <w:spacing w:line="360" w:lineRule="auto" w:after="120"/>
-        <w:jc w:val="left"/>
+        <w:jc w:val="both"/>
       </w:pPr>
       <w:r>
         <w:rPr>
@@ -11438,7 +13051,7 @@
     <w:p>
       <w:pPr>
         <w:spacing w:line="360" w:lineRule="auto" w:after="120"/>
-        <w:jc w:val="left"/>
+        <w:jc w:val="both"/>
       </w:pPr>
       <w:r>
         <w:rPr>
@@ -11908,7 +13521,7 @@
     <w:p>
       <w:pPr>
         <w:spacing w:line="360" w:lineRule="auto" w:after="120"/>
-        <w:jc w:val="left"/>
+        <w:jc w:val="both"/>
       </w:pPr>
       <w:r>
         <w:rPr>
@@ -12592,7 +14205,7 @@
     <w:p>
       <w:pPr>
         <w:spacing w:line="360" w:lineRule="auto" w:after="120"/>
-        <w:jc w:val="left"/>
+        <w:jc w:val="both"/>
       </w:pPr>
       <w:r>
         <w:rPr>
@@ -12642,7 +14255,7 @@
     <w:p>
       <w:pPr>
         <w:spacing w:line="360" w:lineRule="auto" w:after="120"/>
-        <w:jc w:val="left"/>
+        <w:jc w:val="both"/>
       </w:pPr>
       <w:r>
         <w:rPr>
@@ -12657,7 +14270,7 @@
     <w:p>
       <w:pPr>
         <w:spacing w:line="360" w:lineRule="auto" w:after="120"/>
-        <w:jc w:val="left"/>
+        <w:jc w:val="both"/>
       </w:pPr>
       <w:r>
         <w:rPr>
@@ -12687,7 +14300,7 @@
     <w:p>
       <w:pPr>
         <w:spacing w:line="360" w:lineRule="auto" w:after="120"/>
-        <w:jc w:val="left"/>
+        <w:jc w:val="both"/>
       </w:pPr>
       <w:r>
         <w:rPr>
@@ -12717,7 +14330,7 @@
     <w:p>
       <w:pPr>
         <w:spacing w:line="360" w:lineRule="auto" w:after="120"/>
-        <w:jc w:val="left"/>
+        <w:jc w:val="both"/>
       </w:pPr>
       <w:r>
         <w:rPr>
@@ -12733,6 +14346,7 @@
       <w:pPr>
         <w:pStyle w:val="ListBullet"/>
         <w:spacing w:line="360" w:lineRule="auto" w:after="80"/>
+        <w:jc w:val="both"/>
       </w:pPr>
       <w:r>
         <w:rPr>
@@ -12754,6 +14368,7 @@
       <w:pPr>
         <w:pStyle w:val="ListBullet"/>
         <w:spacing w:line="360" w:lineRule="auto" w:after="80"/>
+        <w:jc w:val="both"/>
       </w:pPr>
       <w:r>
         <w:rPr>
@@ -12775,6 +14390,7 @@
       <w:pPr>
         <w:pStyle w:val="ListBullet"/>
         <w:spacing w:line="360" w:lineRule="auto" w:after="80"/>
+        <w:jc w:val="both"/>
       </w:pPr>
       <w:r>
         <w:rPr>
@@ -12796,6 +14412,7 @@
       <w:pPr>
         <w:pStyle w:val="ListBullet"/>
         <w:spacing w:line="360" w:lineRule="auto" w:after="80"/>
+        <w:jc w:val="both"/>
       </w:pPr>
       <w:r>
         <w:rPr>
@@ -12832,6 +14449,7 @@
       <w:pPr>
         <w:pStyle w:val="ListBullet"/>
         <w:spacing w:line="360" w:lineRule="auto" w:after="80"/>
+        <w:jc w:val="both"/>
       </w:pPr>
       <w:r>
         <w:rPr>
@@ -12853,6 +14471,7 @@
       <w:pPr>
         <w:pStyle w:val="ListBullet"/>
         <w:spacing w:line="360" w:lineRule="auto" w:after="80"/>
+        <w:jc w:val="both"/>
       </w:pPr>
       <w:r>
         <w:rPr>
@@ -12888,7 +14507,7 @@
     <w:p>
       <w:pPr>
         <w:spacing w:line="360" w:lineRule="auto" w:after="120"/>
-        <w:jc w:val="left"/>
+        <w:jc w:val="both"/>
       </w:pPr>
       <w:r>
         <w:rPr>
@@ -12938,7 +14557,7 @@
     <w:p>
       <w:pPr>
         <w:spacing w:line="360" w:lineRule="auto" w:after="120"/>
-        <w:jc w:val="left"/>
+        <w:jc w:val="both"/>
       </w:pPr>
       <w:r>
         <w:rPr>
@@ -12968,7 +14587,7 @@
     <w:p>
       <w:pPr>
         <w:spacing w:line="360" w:lineRule="auto" w:after="120"/>
-        <w:jc w:val="left"/>
+        <w:jc w:val="both"/>
       </w:pPr>
       <w:r>
         <w:rPr>
@@ -12984,6 +14603,7 @@
       <w:pPr>
         <w:pStyle w:val="ListBullet"/>
         <w:spacing w:line="360" w:lineRule="auto" w:after="80"/>
+        <w:jc w:val="both"/>
       </w:pPr>
       <w:r>
         <w:rPr>
@@ -13005,6 +14625,7 @@
       <w:pPr>
         <w:pStyle w:val="ListBullet"/>
         <w:spacing w:line="360" w:lineRule="auto" w:after="80"/>
+        <w:jc w:val="both"/>
       </w:pPr>
       <w:r>
         <w:rPr>
@@ -13026,6 +14647,7 @@
       <w:pPr>
         <w:pStyle w:val="ListBullet"/>
         <w:spacing w:line="360" w:lineRule="auto" w:after="80"/>
+        <w:jc w:val="both"/>
       </w:pPr>
       <w:r>
         <w:rPr>
@@ -13047,6 +14669,7 @@
       <w:pPr>
         <w:pStyle w:val="ListBullet"/>
         <w:spacing w:line="360" w:lineRule="auto" w:after="80"/>
+        <w:jc w:val="both"/>
       </w:pPr>
       <w:r>
         <w:rPr>
@@ -13068,6 +14691,7 @@
       <w:pPr>
         <w:pStyle w:val="ListBullet"/>
         <w:spacing w:line="360" w:lineRule="auto" w:after="80"/>
+        <w:jc w:val="both"/>
       </w:pPr>
       <w:r>
         <w:rPr>
@@ -13089,6 +14713,7 @@
       <w:pPr>
         <w:pStyle w:val="ListBullet"/>
         <w:spacing w:line="360" w:lineRule="auto" w:after="80"/>
+        <w:jc w:val="both"/>
       </w:pPr>
       <w:r>
         <w:rPr>
@@ -13110,6 +14735,7 @@
       <w:pPr>
         <w:pStyle w:val="ListBullet"/>
         <w:spacing w:line="360" w:lineRule="auto" w:after="80"/>
+        <w:jc w:val="both"/>
       </w:pPr>
       <w:r>
         <w:rPr>
@@ -13131,6 +14757,7 @@
       <w:pPr>
         <w:pStyle w:val="ListBullet"/>
         <w:spacing w:line="360" w:lineRule="auto" w:after="80"/>
+        <w:jc w:val="both"/>
       </w:pPr>
       <w:r>
         <w:rPr>
@@ -13167,6 +14794,7 @@
       <w:pPr>
         <w:pStyle w:val="ListBullet"/>
         <w:spacing w:line="360" w:lineRule="auto" w:after="80"/>
+        <w:jc w:val="both"/>
       </w:pPr>
       <w:r>
         <w:rPr>
@@ -13188,6 +14816,7 @@
       <w:pPr>
         <w:pStyle w:val="ListBullet"/>
         <w:spacing w:line="360" w:lineRule="auto" w:after="80"/>
+        <w:jc w:val="both"/>
       </w:pPr>
       <w:r>
         <w:rPr>
@@ -13224,6 +14853,7 @@
       <w:pPr>
         <w:pStyle w:val="ListBullet"/>
         <w:spacing w:line="360" w:lineRule="auto" w:after="80"/>
+        <w:jc w:val="both"/>
       </w:pPr>
       <w:r>
         <w:rPr>
@@ -13245,6 +14875,7 @@
       <w:pPr>
         <w:pStyle w:val="ListBullet"/>
         <w:spacing w:line="360" w:lineRule="auto" w:after="80"/>
+        <w:jc w:val="both"/>
       </w:pPr>
       <w:r>
         <w:rPr>
@@ -13266,6 +14897,7 @@
       <w:pPr>
         <w:pStyle w:val="ListBullet"/>
         <w:spacing w:line="360" w:lineRule="auto" w:after="80"/>
+        <w:jc w:val="both"/>
       </w:pPr>
       <w:r>
         <w:rPr>
@@ -13301,7 +14933,7 @@
     <w:p>
       <w:pPr>
         <w:spacing w:line="360" w:lineRule="auto" w:after="120"/>
-        <w:jc w:val="left"/>
+        <w:jc w:val="both"/>
       </w:pPr>
       <w:r>
         <w:rPr>
@@ -13336,6 +14968,7 @@
     <w:p>
       <w:pPr>
         <w:spacing w:after="80"/>
+        <w:jc w:val="left"/>
       </w:pPr>
       <w:r>
         <w:rPr>
@@ -13348,6 +14981,7 @@
     <w:p>
       <w:pPr>
         <w:spacing w:after="80"/>
+        <w:jc w:val="left"/>
       </w:pPr>
       <w:r>
         <w:rPr>
@@ -13360,6 +14994,7 @@
     <w:p>
       <w:pPr>
         <w:spacing w:after="80"/>
+        <w:jc w:val="left"/>
       </w:pPr>
       <w:r>
         <w:rPr>
@@ -13372,6 +15007,7 @@
     <w:p>
       <w:pPr>
         <w:spacing w:after="80"/>
+        <w:jc w:val="left"/>
       </w:pPr>
       <w:r>
         <w:rPr>
@@ -13384,6 +15020,7 @@
     <w:p>
       <w:pPr>
         <w:spacing w:after="80"/>
+        <w:jc w:val="left"/>
       </w:pPr>
       <w:r>
         <w:rPr>
@@ -13396,6 +15033,7 @@
     <w:p>
       <w:pPr>
         <w:spacing w:after="80"/>
+        <w:jc w:val="left"/>
       </w:pPr>
       <w:r>
         <w:rPr>
@@ -13408,6 +15046,7 @@
     <w:p>
       <w:pPr>
         <w:spacing w:after="80"/>
+        <w:jc w:val="left"/>
       </w:pPr>
       <w:r>
         <w:rPr>
@@ -13420,6 +15059,7 @@
     <w:p>
       <w:pPr>
         <w:spacing w:after="80"/>
+        <w:jc w:val="left"/>
       </w:pPr>
       <w:r>
         <w:rPr>
@@ -13432,6 +15072,7 @@
     <w:p>
       <w:pPr>
         <w:spacing w:after="80"/>
+        <w:jc w:val="left"/>
       </w:pPr>
       <w:r>
         <w:rPr>
@@ -13444,6 +15085,7 @@
     <w:p>
       <w:pPr>
         <w:spacing w:after="80"/>
+        <w:jc w:val="left"/>
       </w:pPr>
       <w:r>
         <w:rPr>
@@ -13456,6 +15098,7 @@
     <w:p>
       <w:pPr>
         <w:spacing w:after="80"/>
+        <w:jc w:val="left"/>
       </w:pPr>
       <w:r>
         <w:rPr>
@@ -13468,6 +15111,7 @@
     <w:p>
       <w:pPr>
         <w:spacing w:after="80"/>
+        <w:jc w:val="left"/>
       </w:pPr>
       <w:r>
         <w:rPr>
@@ -13480,6 +15124,7 @@
     <w:p>
       <w:pPr>
         <w:spacing w:after="80"/>
+        <w:jc w:val="left"/>
       </w:pPr>
       <w:r>
         <w:rPr>
@@ -13492,6 +15137,7 @@
     <w:p>
       <w:pPr>
         <w:spacing w:after="80"/>
+        <w:jc w:val="left"/>
       </w:pPr>
       <w:r>
         <w:rPr>
@@ -13504,6 +15150,7 @@
     <w:p>
       <w:pPr>
         <w:spacing w:after="80"/>
+        <w:jc w:val="left"/>
       </w:pPr>
       <w:r>
         <w:rPr>
@@ -13516,6 +15163,7 @@
     <w:p>
       <w:pPr>
         <w:spacing w:after="80"/>
+        <w:jc w:val="left"/>
       </w:pPr>
       <w:r>
         <w:rPr>
@@ -13528,6 +15176,7 @@
     <w:p>
       <w:pPr>
         <w:spacing w:after="80"/>
+        <w:jc w:val="left"/>
       </w:pPr>
       <w:r>
         <w:rPr>
@@ -13540,6 +15189,7 @@
     <w:p>
       <w:pPr>
         <w:spacing w:after="80"/>
+        <w:jc w:val="left"/>
       </w:pPr>
       <w:r>
         <w:rPr>
@@ -13552,6 +15202,7 @@
     <w:p>
       <w:pPr>
         <w:spacing w:after="80"/>
+        <w:jc w:val="left"/>
       </w:pPr>
       <w:r>
         <w:rPr>
@@ -13564,6 +15215,7 @@
     <w:p>
       <w:pPr>
         <w:spacing w:after="80"/>
+        <w:jc w:val="left"/>
       </w:pPr>
       <w:r>
         <w:rPr>
@@ -13576,6 +15228,7 @@
     <w:p>
       <w:pPr>
         <w:spacing w:after="80"/>
+        <w:jc w:val="left"/>
       </w:pPr>
       <w:r>
         <w:rPr>
@@ -13588,6 +15241,7 @@
     <w:p>
       <w:pPr>
         <w:spacing w:after="80"/>
+        <w:jc w:val="left"/>
       </w:pPr>
       <w:r>
         <w:rPr>
@@ -13600,6 +15254,7 @@
     <w:p>
       <w:pPr>
         <w:spacing w:after="80"/>
+        <w:jc w:val="left"/>
       </w:pPr>
       <w:r>
         <w:rPr>
@@ -13612,6 +15267,7 @@
     <w:p>
       <w:pPr>
         <w:spacing w:after="80"/>
+        <w:jc w:val="left"/>
       </w:pPr>
       <w:r>
         <w:rPr>
@@ -13624,6 +15280,7 @@
     <w:p>
       <w:pPr>
         <w:spacing w:after="80"/>
+        <w:jc w:val="left"/>
       </w:pPr>
       <w:r>
         <w:rPr>
@@ -14017,6 +15674,7 @@
       <w:pPr>
         <w:pStyle w:val="ListBullet"/>
         <w:spacing w:line="360" w:lineRule="auto" w:after="80"/>
+        <w:jc w:val="both"/>
       </w:pPr>
       <w:r>
         <w:rPr>
@@ -14038,6 +15696,7 @@
       <w:pPr>
         <w:pStyle w:val="ListBullet"/>
         <w:spacing w:line="360" w:lineRule="auto" w:after="80"/>
+        <w:jc w:val="both"/>
       </w:pPr>
       <w:r>
         <w:rPr>
@@ -14059,6 +15718,7 @@
       <w:pPr>
         <w:pStyle w:val="ListBullet"/>
         <w:spacing w:line="360" w:lineRule="auto" w:after="80"/>
+        <w:jc w:val="both"/>
       </w:pPr>
       <w:r>
         <w:rPr>
@@ -14080,6 +15740,7 @@
       <w:pPr>
         <w:pStyle w:val="ListBullet"/>
         <w:spacing w:line="360" w:lineRule="auto" w:after="80"/>
+        <w:jc w:val="both"/>
       </w:pPr>
       <w:r>
         <w:rPr>
@@ -14101,6 +15762,7 @@
       <w:pPr>
         <w:pStyle w:val="ListBullet"/>
         <w:spacing w:line="360" w:lineRule="auto" w:after="80"/>
+        <w:jc w:val="both"/>
       </w:pPr>
       <w:r>
         <w:rPr>
@@ -14122,6 +15784,7 @@
       <w:pPr>
         <w:pStyle w:val="ListBullet"/>
         <w:spacing w:line="360" w:lineRule="auto" w:after="80"/>
+        <w:jc w:val="both"/>
       </w:pPr>
       <w:r>
         <w:rPr>
@@ -14143,6 +15806,7 @@
       <w:pPr>
         <w:pStyle w:val="ListBullet"/>
         <w:spacing w:line="360" w:lineRule="auto" w:after="80"/>
+        <w:jc w:val="both"/>
       </w:pPr>
       <w:r>
         <w:rPr>
@@ -14164,6 +15828,7 @@
       <w:pPr>
         <w:pStyle w:val="ListBullet"/>
         <w:spacing w:line="360" w:lineRule="auto" w:after="80"/>
+        <w:jc w:val="both"/>
       </w:pPr>
       <w:r>
         <w:rPr>
@@ -14185,6 +15850,7 @@
       <w:pPr>
         <w:pStyle w:val="ListBullet"/>
         <w:spacing w:line="360" w:lineRule="auto" w:after="80"/>
+        <w:jc w:val="both"/>
       </w:pPr>
       <w:r>
         <w:rPr>
@@ -14206,6 +15872,7 @@
       <w:pPr>
         <w:pStyle w:val="ListBullet"/>
         <w:spacing w:line="360" w:lineRule="auto" w:after="80"/>
+        <w:jc w:val="both"/>
       </w:pPr>
       <w:r>
         <w:rPr>
@@ -14227,6 +15894,7 @@
       <w:pPr>
         <w:pStyle w:val="ListBullet"/>
         <w:spacing w:line="360" w:lineRule="auto" w:after="80"/>
+        <w:jc w:val="both"/>
       </w:pPr>
       <w:r>
         <w:rPr>
@@ -14248,6 +15916,7 @@
       <w:pPr>
         <w:pStyle w:val="ListBullet"/>
         <w:spacing w:line="360" w:lineRule="auto" w:after="80"/>
+        <w:jc w:val="both"/>
       </w:pPr>
       <w:r>
         <w:rPr>
@@ -14284,6 +15953,7 @@
       <w:pPr>
         <w:pStyle w:val="ListBullet"/>
         <w:spacing w:line="360" w:lineRule="auto" w:after="80"/>
+        <w:jc w:val="both"/>
       </w:pPr>
       <w:r>
         <w:rPr>
@@ -14305,6 +15975,7 @@
       <w:pPr>
         <w:pStyle w:val="ListBullet"/>
         <w:spacing w:line="360" w:lineRule="auto" w:after="80"/>
+        <w:jc w:val="both"/>
       </w:pPr>
       <w:r>
         <w:rPr>
@@ -14326,6 +15997,7 @@
       <w:pPr>
         <w:pStyle w:val="ListBullet"/>
         <w:spacing w:line="360" w:lineRule="auto" w:after="80"/>
+        <w:jc w:val="both"/>
       </w:pPr>
       <w:r>
         <w:rPr>
@@ -14347,6 +16019,7 @@
       <w:pPr>
         <w:pStyle w:val="ListBullet"/>
         <w:spacing w:line="360" w:lineRule="auto" w:after="80"/>
+        <w:jc w:val="both"/>
       </w:pPr>
       <w:r>
         <w:rPr>
@@ -14368,6 +16041,7 @@
       <w:pPr>
         <w:pStyle w:val="ListBullet"/>
         <w:spacing w:line="360" w:lineRule="auto" w:after="80"/>
+        <w:jc w:val="both"/>
       </w:pPr>
       <w:r>
         <w:rPr>
@@ -14389,6 +16063,7 @@
       <w:pPr>
         <w:pStyle w:val="ListBullet"/>
         <w:spacing w:line="360" w:lineRule="auto" w:after="80"/>
+        <w:jc w:val="both"/>
       </w:pPr>
       <w:r>
         <w:rPr>
@@ -14410,6 +16085,7 @@
       <w:pPr>
         <w:pStyle w:val="ListBullet"/>
         <w:spacing w:line="360" w:lineRule="auto" w:after="80"/>
+        <w:jc w:val="both"/>
       </w:pPr>
       <w:r>
         <w:rPr>
@@ -14446,6 +16122,7 @@
       <w:pPr>
         <w:pStyle w:val="ListBullet"/>
         <w:spacing w:line="360" w:lineRule="auto" w:after="80"/>
+        <w:jc w:val="both"/>
       </w:pPr>
       <w:r>
         <w:rPr>
@@ -14467,6 +16144,7 @@
       <w:pPr>
         <w:pStyle w:val="ListBullet"/>
         <w:spacing w:line="360" w:lineRule="auto" w:after="80"/>
+        <w:jc w:val="both"/>
       </w:pPr>
       <w:r>
         <w:rPr>
@@ -14488,6 +16166,7 @@
       <w:pPr>
         <w:pStyle w:val="ListBullet"/>
         <w:spacing w:line="360" w:lineRule="auto" w:after="80"/>
+        <w:jc w:val="both"/>
       </w:pPr>
       <w:r>
         <w:rPr>
@@ -14509,6 +16188,7 @@
       <w:pPr>
         <w:pStyle w:val="ListBullet"/>
         <w:spacing w:line="360" w:lineRule="auto" w:after="80"/>
+        <w:jc w:val="both"/>
       </w:pPr>
       <w:r>
         <w:rPr>
@@ -14530,6 +16210,7 @@
       <w:pPr>
         <w:pStyle w:val="ListBullet"/>
         <w:spacing w:line="360" w:lineRule="auto" w:after="80"/>
+        <w:jc w:val="both"/>
       </w:pPr>
       <w:r>
         <w:rPr>
@@ -14551,6 +16232,7 @@
       <w:pPr>
         <w:pStyle w:val="ListBullet"/>
         <w:spacing w:line="360" w:lineRule="auto" w:after="80"/>
+        <w:jc w:val="both"/>
       </w:pPr>
       <w:r>
         <w:rPr>
@@ -14572,6 +16254,7 @@
       <w:pPr>
         <w:pStyle w:val="ListBullet"/>
         <w:spacing w:line="360" w:lineRule="auto" w:after="80"/>
+        <w:jc w:val="both"/>
       </w:pPr>
       <w:r>
         <w:rPr>
@@ -14593,6 +16276,7 @@
       <w:pPr>
         <w:pStyle w:val="ListBullet"/>
         <w:spacing w:line="360" w:lineRule="auto" w:after="80"/>
+        <w:jc w:val="both"/>
       </w:pPr>
       <w:r>
         <w:rPr>
@@ -14614,6 +16298,7 @@
       <w:pPr>
         <w:pStyle w:val="ListBullet"/>
         <w:spacing w:line="360" w:lineRule="auto" w:after="80"/>
+        <w:jc w:val="both"/>
       </w:pPr>
       <w:r>
         <w:rPr>

</xml_diff>